<commit_message>
Further Android and Web Portal Upgrades
</commit_message>
<xml_diff>
--- a/Documentation/User Manual/TurnHub Manual V0.2.docx
+++ b/Documentation/User Manual/TurnHub Manual V0.2.docx
@@ -1034,6 +1034,49 @@
     </w:p>
     <w:p>
       <w:pPr>
+        <w:pStyle w:val="Heading2"/>
+        <w:rPr>
+          <w:ins w:id="9003" w:author="Claude" w:date="2026-09-24T00:00:00Z"/>
+          <w:rFonts w:eastAsia="Times New Roman"/>
+        </w:rPr>
+      </w:pPr>
+      <w:ins w:id="9004" w:author="Claude" w:date="2026-09-24T00:00:00Z">
+        <w:r>
+          <w:rPr>
+            <w:rFonts w:eastAsia="Times New Roman"/>
+          </w:rPr>
+          <w:t xml:space="preserve">Using the Android App</w:t>
+        </w:r>
+      </w:ins>
+    </w:p>
+    <w:p>
+      <w:pPr>
+        <w:pStyle w:val="NormalWeb"/>
+        <w:rPr>
+          <w:ins w:id="9005" w:author="Claude" w:date="2026-09-24T00:00:00Z"/>
+        </w:rPr>
+      </w:pPr>
+      <w:ins w:id="9006" w:author="Claude" w:date="2026-09-24T00:00:00Z">
+        <w:r>
+          <w:t xml:space="preserve">The TurnHub Android app joins the Atlas Wi-Fi and shows the table. A player can sign in with their profile PIN, join the table in the lobby, pass, and pause or resume the game.</w:t>
+        </w:r>
+      </w:ins>
+    </w:p>
+    <w:p>
+      <w:pPr>
+        <w:pStyle w:val="NormalWeb"/>
+        <w:rPr>
+          <w:ins w:id="9007" w:author="Claude" w:date="2026-09-24T00:00:00Z"/>
+        </w:rPr>
+      </w:pPr>
+      <w:ins w:id="9008" w:author="Claude" w:date="2026-09-24T00:00:00Z">
+        <w:r>
+          <w:t xml:space="preserve">The app shows the same turn clock as the Sigils and the browser, because Atlas keeps the time.</w:t>
+        </w:r>
+      </w:ins>
+    </w:p>
+    <w:p>
+      <w:pPr>
         <w:rPr>
           <w:rFonts w:eastAsia="Times New Roman"/>
         </w:rPr>
@@ -1690,6 +1733,27 @@
         </w:numPr>
         <w:spacing w:before="100" w:beforeAutospacing="1" w:after="100" w:afterAutospacing="1" w:line="240" w:lineRule="auto"/>
         <w:rPr>
+          <w:ins w:id="9001" w:author="Claude" w:date="2026-09-24T00:00:00Z"/>
+          <w:rFonts w:eastAsia="Times New Roman"/>
+        </w:rPr>
+      </w:pPr>
+      <w:ins w:id="9002" w:author="Claude" w:date="2026-09-24T00:00:00Z">
+        <w:r>
+          <w:rPr>
+            <w:rFonts w:eastAsia="Times New Roman"/>
+          </w:rPr>
+          <w:t xml:space="preserve">Choose a turn timer: Off, a preset (1, 2, 3 or 5 minutes), or a custom length.</w:t>
+        </w:r>
+      </w:ins>
+    </w:p>
+    <w:p>
+      <w:pPr>
+        <w:numPr>
+          <w:ilvl w:val="0"/>
+          <w:numId w:val="7"/>
+        </w:numPr>
+        <w:spacing w:before="100" w:beforeAutospacing="1" w:after="100" w:afterAutospacing="1" w:line="240" w:lineRule="auto"/>
+        <w:rPr>
           <w:rFonts w:eastAsia="Times New Roman"/>
         </w:rPr>
       </w:pPr>
@@ -1935,6 +1999,151 @@
       <w:r>
         <w:t>A distinct alert is used for a self-pass so it is not easily confused with normal turn progression.</w:t>
       </w:r>
+    </w:p>
+    <w:p>
+      <w:pPr>
+        <w:pStyle w:val="Heading2"/>
+        <w:rPr>
+          <w:ins w:id="9009" w:author="Claude" w:date="2026-09-24T00:00:00Z"/>
+          <w:rFonts w:eastAsia="Times New Roman"/>
+        </w:rPr>
+      </w:pPr>
+      <w:ins w:id="9010" w:author="Claude" w:date="2026-09-24T00:00:00Z">
+        <w:r>
+          <w:rPr>
+            <w:rFonts w:eastAsia="Times New Roman"/>
+          </w:rPr>
+          <w:t xml:space="preserve">Turn Timer</w:t>
+        </w:r>
+      </w:ins>
+    </w:p>
+    <w:p>
+      <w:pPr>
+        <w:pStyle w:val="NormalWeb"/>
+        <w:rPr>
+          <w:ins w:id="9011" w:author="Claude" w:date="2026-09-24T00:00:00Z"/>
+        </w:rPr>
+      </w:pPr>
+      <w:ins w:id="9012" w:author="Claude" w:date="2026-09-24T00:00:00Z">
+        <w:r>
+          <w:t xml:space="preserve">The table host chooses the turn timer in the lobby, from the browser interface or the Android app. The setting applies from the next game that starts.</w:t>
+        </w:r>
+      </w:ins>
+    </w:p>
+    <w:p>
+      <w:pPr>
+        <w:numPr>
+          <w:ilvl w:val="0"/>
+          <w:numId w:val="11"/>
+        </w:numPr>
+        <w:spacing w:before="100" w:beforeAutospacing="1" w:after="100" w:afterAutospacing="1" w:line="240" w:lineRule="auto"/>
+        <w:rPr>
+          <w:ins w:id="9013" w:author="Claude" w:date="2026-09-24T00:00:00Z"/>
+          <w:rFonts w:eastAsia="Times New Roman"/>
+        </w:rPr>
+      </w:pPr>
+      <w:ins w:id="9014" w:author="Claude" w:date="2026-09-24T00:00:00Z">
+        <w:r>
+          <w:rPr>
+            <w:rFonts w:eastAsia="Times New Roman"/>
+          </w:rPr>
+          <w:t xml:space="preserve">Off: there is no countdown. After a turn has lasted five minutes, the active player’s Sigil shows a steady green light as a gentle reminder.</w:t>
+        </w:r>
+      </w:ins>
+    </w:p>
+    <w:p>
+      <w:pPr>
+        <w:numPr>
+          <w:ilvl w:val="0"/>
+          <w:numId w:val="11"/>
+        </w:numPr>
+        <w:spacing w:before="100" w:beforeAutospacing="1" w:after="100" w:afterAutospacing="1" w:line="240" w:lineRule="auto"/>
+        <w:rPr>
+          <w:ins w:id="9015" w:author="Claude" w:date="2026-09-24T00:00:00Z"/>
+          <w:rFonts w:eastAsia="Times New Roman"/>
+        </w:rPr>
+      </w:pPr>
+      <w:ins w:id="9016" w:author="Claude" w:date="2026-09-24T00:00:00Z">
+        <w:r>
+          <w:rPr>
+            <w:rFonts w:eastAsia="Times New Roman"/>
+          </w:rPr>
+          <w:t xml:space="preserve">Presets: 1, 2, 3 or 5 minutes.</w:t>
+        </w:r>
+      </w:ins>
+    </w:p>
+    <w:p>
+      <w:pPr>
+        <w:numPr>
+          <w:ilvl w:val="0"/>
+          <w:numId w:val="11"/>
+        </w:numPr>
+        <w:spacing w:before="100" w:beforeAutospacing="1" w:after="100" w:afterAutospacing="1" w:line="240" w:lineRule="auto"/>
+        <w:rPr>
+          <w:ins w:id="9017" w:author="Claude" w:date="2026-09-24T00:00:00Z"/>
+          <w:rFonts w:eastAsia="Times New Roman"/>
+        </w:rPr>
+      </w:pPr>
+      <w:ins w:id="9018" w:author="Claude" w:date="2026-09-24T00:00:00Z">
+        <w:r>
+          <w:rPr>
+            <w:rFonts w:eastAsia="Times New Roman"/>
+          </w:rPr>
+          <w:t xml:space="preserve">Custom: any whole number of seconds from 15 seconds to 60 minutes.</w:t>
+        </w:r>
+      </w:ins>
+    </w:p>
+    <w:p>
+      <w:pPr>
+        <w:pStyle w:val="NormalWeb"/>
+        <w:rPr>
+          <w:ins w:id="9019" w:author="Claude" w:date="2026-09-24T00:00:00Z"/>
+        </w:rPr>
+      </w:pPr>
+      <w:ins w:id="9020" w:author="Claude" w:date="2026-09-24T00:00:00Z">
+        <w:r>
+          <w:t xml:space="preserve">With a timer set, each turn counts down from the full time. Pausing the game stops the countdown, and passing starts a fresh countdown for the next player.</w:t>
+        </w:r>
+      </w:ins>
+    </w:p>
+    <w:p>
+      <w:pPr>
+        <w:pStyle w:val="NormalWeb"/>
+        <w:rPr>
+          <w:ins w:id="9021" w:author="Claude" w:date="2026-09-24T00:00:00Z"/>
+        </w:rPr>
+      </w:pPr>
+      <w:ins w:id="9022" w:author="Claude" w:date="2026-09-24T00:00:00Z">
+        <w:r>
+          <w:t xml:space="preserve">When 10 seconds are left, the active player’s Sigil plays a short chirp and its red light pulses slowly. The browser and the app show the time left and a warning.</w:t>
+        </w:r>
+      </w:ins>
+    </w:p>
+    <w:p>
+      <w:pPr>
+        <w:pStyle w:val="NormalWeb"/>
+        <w:rPr>
+          <w:ins w:id="9023" w:author="Claude" w:date="2026-09-24T00:00:00Z"/>
+        </w:rPr>
+      </w:pPr>
+      <w:ins w:id="9024" w:author="Claude" w:date="2026-09-24T00:00:00Z">
+        <w:r>
+          <w:t xml:space="preserve">When time runs out, the Sigil plays two low notes and its red light stays on. The browser and the app show how far over time the turn is. The turn does not end automatically: the player passes as usual.</w:t>
+        </w:r>
+      </w:ins>
+    </w:p>
+    <w:p>
+      <w:pPr>
+        <w:pStyle w:val="NormalWeb"/>
+        <w:rPr>
+          <w:ins w:id="9025" w:author="Claude" w:date="2026-09-24T00:00:00Z"/>
+        </w:rPr>
+      </w:pPr>
+      <w:ins w:id="9026" w:author="Claude" w:date="2026-09-24T00:00:00Z">
+        <w:r>
+          <w:t xml:space="preserve">The red light pulses during the warning and stays steady once time is up, so the two can be told apart without relying on color.</w:t>
+        </w:r>
+      </w:ins>
     </w:p>
     <w:p>
       <w:pPr>
@@ -2796,6 +3005,19 @@
     </w:p>
     <w:p>
       <w:pPr>
+        <w:pStyle w:val="NormalWeb"/>
+        <w:rPr>
+          <w:ins w:id="9027" w:author="Claude" w:date="2026-09-24T00:00:00Z"/>
+        </w:rPr>
+      </w:pPr>
+      <w:ins w:id="9028" w:author="Claude" w:date="2026-09-24T00:00:00Z">
+        <w:r>
+          <w:t xml:space="preserve">Turn-timer alerts (the 10-second warning and time running out) always appear as text in the browser and the app, as well as through the Sigil’s light and sound.</w:t>
+        </w:r>
+      </w:ins>
+    </w:p>
+    <w:p>
+      <w:pPr>
         <w:rPr>
           <w:rFonts w:eastAsia="Times New Roman"/>
         </w:rPr>
@@ -4771,6 +4993,66 @@
       <w:r>
         <w:t>Review the requested change before accepting it.</w:t>
       </w:r>
+    </w:p>
+    <w:p>
+      <w:pPr>
+        <w:pStyle w:val="Heading2"/>
+        <w:rPr>
+          <w:ins w:id="9029" w:author="Claude" w:date="2026-09-24T00:00:00Z"/>
+          <w:rFonts w:eastAsia="Times New Roman"/>
+        </w:rPr>
+      </w:pPr>
+      <w:ins w:id="9030" w:author="Claude" w:date="2026-09-24T00:00:00Z">
+        <w:r>
+          <w:rPr>
+            <w:rFonts w:eastAsia="Times New Roman"/>
+          </w:rPr>
+          <w:t xml:space="preserve">The Turn Timer Ran Out but the Turn Did Not Change</w:t>
+        </w:r>
+      </w:ins>
+    </w:p>
+    <w:p>
+      <w:pPr>
+        <w:pStyle w:val="NormalWeb"/>
+        <w:rPr>
+          <w:ins w:id="9031" w:author="Claude" w:date="2026-09-24T00:00:00Z"/>
+        </w:rPr>
+      </w:pPr>
+      <w:ins w:id="9032" w:author="Claude" w:date="2026-09-24T00:00:00Z">
+        <w:r>
+          <w:t xml:space="preserve">This is expected. Running out of time is a reminder only; TurnHub never passes a turn on its own. The active player passes when ready.</w:t>
+        </w:r>
+      </w:ins>
+    </w:p>
+    <w:p>
+      <w:pPr>
+        <w:pStyle w:val="Heading2"/>
+        <w:rPr>
+          <w:ins w:id="9033" w:author="Claude" w:date="2026-09-24T00:00:00Z"/>
+          <w:rFonts w:eastAsia="Times New Roman"/>
+        </w:rPr>
+      </w:pPr>
+      <w:ins w:id="9034" w:author="Claude" w:date="2026-09-24T00:00:00Z">
+        <w:r>
+          <w:rPr>
+            <w:rFonts w:eastAsia="Times New Roman"/>
+          </w:rPr>
+          <w:t xml:space="preserve">I Cannot Change the Turn Timer</w:t>
+        </w:r>
+      </w:ins>
+    </w:p>
+    <w:p>
+      <w:pPr>
+        <w:pStyle w:val="NormalWeb"/>
+        <w:rPr>
+          <w:ins w:id="9035" w:author="Claude" w:date="2026-09-24T00:00:00Z"/>
+        </w:rPr>
+      </w:pPr>
+      <w:ins w:id="9036" w:author="Claude" w:date="2026-09-24T00:00:00Z">
+        <w:r>
+          <w:t xml:space="preserve">Only the table host can change the turn timer, and only in the lobby before the game starts.</w:t>
+        </w:r>
+      </w:ins>
     </w:p>
     <w:p>
       <w:pPr>

</xml_diff>

<commit_message>
Manual V0.2: accessibility settings (tracked changes)
Adds an Accessibility Settings subsection under Nudges and Alerts (Sigil
sound, light style, hold times, shared-Sigil rules, the decision tone,
browser appearance and Android system settings), a pointer from Sigil
Controls, and a troubleshooting entry for longer holds. All insertions
are tracked changes by Claude for the owner to review in Word.

Co-Authored-By: Claude Opus 5.5 <noreply@anthropic.com>
Claude-Session: https://claude.ai/code/session_01RYQ71iURGsU5zU9bGT83PG
</commit_message>
<xml_diff>
--- a/Documentation/User Manual/TurnHub Manual V0.2.docx
+++ b/Documentation/User Manual/TurnHub Manual V0.2.docx
@@ -153,7 +153,7 @@
           </mc:Choice>
           <mc:Fallback>
             <w:pict>
-              <v:rect w14:anchorId="6893B19A" id="Rectangle 25" o:spid="_x0000_s1026" style="width:468pt;height:.1pt;visibility:visible;mso-wrap-style:square;mso-left-percent:-10001;mso-top-percent:-10001;mso-position-horizontal:absolute;mso-position-horizontal-relative:char;mso-position-vertical:absolute;mso-position-vertical-relative:line;mso-left-percent:-10001;mso-top-percent:-10001;v-text-anchor:top" o:gfxdata="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" filled="f">
+              <v:rect w14:anchorId="6893B19A" id="Rectangle 25" o:spid="_x0000_s1026" style="width:468pt;height:.1pt;visibility:visible;mso-wrap-style:square;mso-left-percent:-10001;mso-top-percent:-10001;mso-position-horizontal:absolute;mso-position-horizontal-relative:char;mso-position-vertical:absolute;mso-position-vertical-relative:line;mso-left-percent:-10001;mso-top-percent:-10001;v-text-anchor:top" o:gfxdata="UEsDBBQABgAIAAAAIQBaIpOj/wAAAOUBAAATAAAAW0NvbnRlbnRfVHlwZXNdLnhtbJSRQU7DMBBF 90jcwZotSpx2gRBK0gVpl4BQOYBlTxKLZGx5TGhvj5NCF4gisbRn/n9Pdrk5jIOYMLB1VMEqL0Ag aWcsdRW87nfZHQiOiowaHGEFR2TY1NdX5f7okUVKE1fQx+jvpWTd46g4dx4pTVoXRhXTMXTSK/2m OpTroriV2lFEilmcO6AuG2zV+xDF9pCuTyYBBwbxcFqcWRUo7werVUymciLzg5J9EfKUXHa4t55v kgYI+StiGV0kfAef0uMEa1A8qxAf1ZhEpAksce0ap/O/S2bNkTPXtlZj3gTeLqmz1aVy4z4o4PTf 9ibFXnA618vlk+pPAAAA//8DAFBLAwQUAAYACAAAACEAp0rPONcAAACWAQAACwAAAF9yZWxzLy5y ZWxzpJDBasMwDIbvg72D0X1xmsMYo04vo9Br6R7A2IpjGltGMtn69jM7jGX0tqN+oe/70f7wmRa1 IkukbGDX9aAwO/IxBwPvl+PTCyipNnu7UEYDNxQ4jI8P+zMutrYjmWMR1ShZDMy1lletxc2YrHRU MLfNRJxsbSMHXay72oB66Ptnzb8ZMG6Y6uQN8MkPoC630sx/2Ck6JqGpdo6SpmmK7h5Ve/rIZ1wb xXLAasCzfIeMa9fKgdL3xbt/igPbMkd3ZJvwjdy2AA7Ush+/3nxz/AIAAP//AwBQSwMEFAAGAAgA AAAhAD6L9189AgAAeQQAAA4AAABkcnMvZTJvRG9jLnhtbKxU227bMAx9H7B/EPS+2s6SpjXqFEUv w4DuAnTDnhVZtoXJokYpcbKvHyU7l21vw2JAEEXxkIdHzM3trjdsq9BrsBUvLnLOlJVQa9tW/OuX pzdXnPkgbC0MWFXxvfL8dvX61c3gSjWDDkytkBGI9eXgKt6F4Mos87JTvfAX4JQlZwPYi0AmtlmN YiD03mSzPL/MBsDaIUjlPZ0+jE6+SvhNo2T41DReBWYqTrWFtGJa12nNVjeibFG4TsupDvEPZfRC W8p6hHoQQbAN6r+gei0RPDThQkKfQdNoqRIJolPkf9B56YRTiQx1x7tjn/z/g5Ufty/uM8bSvXsG +d0zC/edsK26Q4ShU6KmdAVn1KlscL48RkTDUyxbDx+gJnHFJkBqwq7BPiISPbZLbd6fmq12gUk6 nReXxXw5W3AmyVvMlqRPzCHKQ7hDH94p6FncVBxJzQQvts8+THcPd2I6C0/amOgQpbFsqPj1gvCj SQrXyYkQvunQpc7GmpLTE964YQ6I7XjssV3fG2RbQY/nLo/focLWn18v8vhLUL/FPL6N33kMkWsP yYy2jNpc8cV8jJ8YHUqNGXodaDyM7it+dbokyqjKo61HqkFoMxmEb+ykU5QmzoEv11DvSSainlSg caVNB/iTs4FefsX9j41AxZl5b4n9dTGfx1lJxnyxnJGB5571uUdYSVAVD5zYxO19GOdr41C3HWUq Umcs3NHzaPQo3KmsqVp63kn7aRTj/Jzb6dbpH2P1CwAA//8DAFBLAwQUAAYACAAAACEApvkTOdwA AAAIAQAADwAAAGRycy9kb3ducmV2LnhtbEyPwU7DMBBE70j9B2srcaNOi6ggjVOlQK+VKEjAzY0X O2q8jmK3CX/PwqVcRhqNdnZesR59K87YxyaQgvksA4FUB9OQVfD2ur25BxGTJqPbQKjgGyOsy8lV oXMTBnrB8z5ZwSUUc63ApdTlUsbaoddxFjokzr5C73Vi21tpej1wuW/lIsuW0uuG+IPTHT46rI/7 k1fw3H3uqjsbZfWe3McxbIat21mlrqfj04qlWoFIOKbLBfwy8H4oedghnMhE0SpgmvSnnD3cLtke FCxAyLKQ/wHKHwAAAP//AwBQSwECLQAUAAYACAAAACEAWiKTo/8AAADlAQAAEwAAAAAAAAAAAAAA AAAAAAAAW0NvbnRlbnRfVHlwZXNdLnhtbFBLAQItABQABgAIAAAAIQCnSs841wAAAJYBAAALAAAA AAAAAAAAAAAAADABAABfcmVscy8ucmVsc1BLAQItABQABgAIAAAAIQA+i/dfPQIAAHkEAAAOAAAA AAAAAAAAAAAAADACAABkcnMvZTJvRG9jLnhtbFBLAQItABQABgAIAAAAIQCm+RM53AAAAAgBAAAP AAAAAAAAAAAAAAAAAJkEAABkcnMvZG93bnJldi54bWxQSwUGAAAAAAQABADzAAAAogUAAAAA " filled="f">
                 <w10:anchorlock/>
               </v:rect>
             </w:pict>
@@ -571,7 +571,7 @@
           </mc:Choice>
           <mc:Fallback>
             <w:pict>
-              <v:rect w14:anchorId="6200E427" id="Rectangle 24" o:spid="_x0000_s1026" style="width:468pt;height:.1pt;visibility:visible;mso-wrap-style:square;mso-left-percent:-10001;mso-top-percent:-10001;mso-position-horizontal:absolute;mso-position-horizontal-relative:char;mso-position-vertical:absolute;mso-position-vertical-relative:line;mso-left-percent:-10001;mso-top-percent:-10001;v-text-anchor:top" o:gfxdata="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" filled="f">
+              <v:rect w14:anchorId="6200E427" id="Rectangle 24" o:spid="_x0000_s1026" style="width:468pt;height:.1pt;visibility:visible;mso-wrap-style:square;mso-left-percent:-10001;mso-top-percent:-10001;mso-position-horizontal:absolute;mso-position-horizontal-relative:char;mso-position-vertical:absolute;mso-position-vertical-relative:line;mso-left-percent:-10001;mso-top-percent:-10001;v-text-anchor:top" o:gfxdata="UEsDBBQABgAIAAAAIQBaIpOj/wAAAOUBAAATAAAAW0NvbnRlbnRfVHlwZXNdLnhtbJSRQU7DMBBF 90jcwZotSpx2gRBK0gVpl4BQOYBlTxKLZGx5TGhvj5NCF4gisbRn/n9Pdrk5jIOYMLB1VMEqL0Ag aWcsdRW87nfZHQiOiowaHGEFR2TY1NdX5f7okUVKE1fQx+jvpWTd46g4dx4pTVoXRhXTMXTSK/2m OpTroriV2lFEilmcO6AuG2zV+xDF9pCuTyYBBwbxcFqcWRUo7werVUymciLzg5J9EfKUXHa4t55v kgYI+StiGV0kfAef0uMEa1A8qxAf1ZhEpAksce0ap/O/S2bNkTPXtlZj3gTeLqmz1aVy4z4o4PTf 9ibFXnA618vlk+pPAAAA//8DAFBLAwQUAAYACAAAACEAp0rPONcAAACWAQAACwAAAF9yZWxzLy5y ZWxzpJDBasMwDIbvg72D0X1xmsMYo04vo9Br6R7A2IpjGltGMtn69jM7jGX0tqN+oe/70f7wmRa1 IkukbGDX9aAwO/IxBwPvl+PTCyipNnu7UEYDNxQ4jI8P+zMutrYjmWMR1ShZDMy1lletxc2YrHRU MLfNRJxsbSMHXay72oB66Ptnzb8ZMG6Y6uQN8MkPoC630sx/2Ck6JqGpdo6SpmmK7h5Ve/rIZ1wb xXLAasCzfIeMa9fKgdL3xbt/igPbMkd3ZJvwjdy2AA7Ush+/3nxz/AIAAP//AwBQSwMEFAAGAAgA AAAhAD6L9189AgAAeQQAAA4AAABkcnMvZTJvRG9jLnhtbKxU227bMAx9H7B/EPS+2s6SpjXqFEUv w4DuAnTDnhVZtoXJokYpcbKvHyU7l21vw2JAEEXxkIdHzM3trjdsq9BrsBUvLnLOlJVQa9tW/OuX pzdXnPkgbC0MWFXxvfL8dvX61c3gSjWDDkytkBGI9eXgKt6F4Mos87JTvfAX4JQlZwPYi0AmtlmN YiD03mSzPL/MBsDaIUjlPZ0+jE6+SvhNo2T41DReBWYqTrWFtGJa12nNVjeibFG4TsupDvEPZfRC W8p6hHoQQbAN6r+gei0RPDThQkKfQdNoqRIJolPkf9B56YRTiQx1x7tjn/z/g5Ufty/uM8bSvXsG +d0zC/edsK26Q4ShU6KmdAVn1KlscL48RkTDUyxbDx+gJnHFJkBqwq7BPiISPbZLbd6fmq12gUk6 nReXxXw5W3AmyVvMlqRPzCHKQ7hDH94p6FncVBxJzQQvts8+THcPd2I6C0/amOgQpbFsqPj1gvCj SQrXyYkQvunQpc7GmpLTE964YQ6I7XjssV3fG2RbQY/nLo/focLWn18v8vhLUL/FPL6N33kMkWsP yYy2jNpc8cV8jJ8YHUqNGXodaDyM7it+dbokyqjKo61HqkFoMxmEb+ykU5QmzoEv11DvSSainlSg caVNB/iTs4FefsX9j41AxZl5b4n9dTGfx1lJxnyxnJGB5571uUdYSVAVD5zYxO19GOdr41C3HWUq Umcs3NHzaPQo3KmsqVp63kn7aRTj/Jzb6dbpH2P1CwAA//8DAFBLAwQUAAYACAAAACEApvkTOdwA AAAIAQAADwAAAGRycy9kb3ducmV2LnhtbEyPwU7DMBBE70j9B2srcaNOi6ggjVOlQK+VKEjAzY0X O2q8jmK3CX/PwqVcRhqNdnZesR59K87YxyaQgvksA4FUB9OQVfD2ur25BxGTJqPbQKjgGyOsy8lV oXMTBnrB8z5ZwSUUc63ApdTlUsbaoddxFjokzr5C73Vi21tpej1wuW/lIsuW0uuG+IPTHT46rI/7 k1fw3H3uqjsbZfWe3McxbIat21mlrqfj04qlWoFIOKbLBfwy8H4oedghnMhE0SpgmvSnnD3cLtke FCxAyLKQ/wHKHwAAAP//AwBQSwECLQAUAAYACAAAACEAWiKTo/8AAADlAQAAEwAAAAAAAAAAAAAA AAAAAAAAW0NvbnRlbnRfVHlwZXNdLnhtbFBLAQItABQABgAIAAAAIQCnSs841wAAAJYBAAALAAAA AAAAAAAAAAAAADABAABfcmVscy8ucmVsc1BLAQItABQABgAIAAAAIQA+i/dfPQIAAHkEAAAOAAAA AAAAAAAAAAAAADACAABkcnMvZTJvRG9jLnhtbFBLAQItABQABgAIAAAAIQCm+RM53AAAAAgBAAAP AAAAAAAAAAAAAAAAAJkEAABkcnMvZG93bnJldi54bWxQSwUGAAAAAAQABADzAAAAogUAAAAA " filled="f">
                 <w10:anchorlock/>
               </v:rect>
             </w:pict>
@@ -688,13 +688,7 @@
         <w:rPr>
           <w:rFonts w:eastAsia="Times New Roman"/>
         </w:rPr>
-        <w:t xml:space="preserve">A phone, tablet, or computer for initial setup when </w:t>
-      </w:r>
-      <w:r>
-        <w:rPr>
-          <w:rFonts w:eastAsia="Times New Roman"/>
-        </w:rPr>
-        <w:t xml:space="preserve">desired, although play can begin without first adding profiles, assigning an administrator role, or ever interacting with the web portal. Note: Player identifications will be limited to “Player 1” “Player 2” etc. when no profiles have been preset. Statistics for these “Player” profiles are not saved. </w:t>
+        <w:t xml:space="preserve">A phone, tablet, or computer for initial setup when desired, although play can begin without first adding profiles, assigning an administrator role, or ever interacting with the web portal. Note: Player identifications will be limited to “Player 1” “Player 2” etc. when no profiles have been preset. Statistics for these “Player” profiles are not saved. </w:t>
       </w:r>
     </w:p>
     <w:p>
@@ -769,7 +763,7 @@
           </mc:Choice>
           <mc:Fallback>
             <w:pict>
-              <v:rect w14:anchorId="591858E6" id="Rectangle 23" o:spid="_x0000_s1026" style="width:468pt;height:.1pt;visibility:visible;mso-wrap-style:square;mso-left-percent:-10001;mso-top-percent:-10001;mso-position-horizontal:absolute;mso-position-horizontal-relative:char;mso-position-vertical:absolute;mso-position-vertical-relative:line;mso-left-percent:-10001;mso-top-percent:-10001;v-text-anchor:top" o:gfxdata="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" filled="f">
+              <v:rect w14:anchorId="591858E6" id="Rectangle 23" o:spid="_x0000_s1026" style="width:468pt;height:.1pt;visibility:visible;mso-wrap-style:square;mso-left-percent:-10001;mso-top-percent:-10001;mso-position-horizontal:absolute;mso-position-horizontal-relative:char;mso-position-vertical:absolute;mso-position-vertical-relative:line;mso-left-percent:-10001;mso-top-percent:-10001;v-text-anchor:top" o:gfxdata="UEsDBBQABgAIAAAAIQBaIpOj/wAAAOUBAAATAAAAW0NvbnRlbnRfVHlwZXNdLnhtbJSRQU7DMBBF 90jcwZotSpx2gRBK0gVpl4BQOYBlTxKLZGx5TGhvj5NCF4gisbRn/n9Pdrk5jIOYMLB1VMEqL0Ag aWcsdRW87nfZHQiOiowaHGEFR2TY1NdX5f7okUVKE1fQx+jvpWTd46g4dx4pTVoXRhXTMXTSK/2m OpTroriV2lFEilmcO6AuG2zV+xDF9pCuTyYBBwbxcFqcWRUo7werVUymciLzg5J9EfKUXHa4t55v kgYI+StiGV0kfAef0uMEa1A8qxAf1ZhEpAksce0ap/O/S2bNkTPXtlZj3gTeLqmz1aVy4z4o4PTf 9ibFXnA618vlk+pPAAAA//8DAFBLAwQUAAYACAAAACEAp0rPONcAAACWAQAACwAAAF9yZWxzLy5y ZWxzpJDBasMwDIbvg72D0X1xmsMYo04vo9Br6R7A2IpjGltGMtn69jM7jGX0tqN+oe/70f7wmRa1 IkukbGDX9aAwO/IxBwPvl+PTCyipNnu7UEYDNxQ4jI8P+zMutrYjmWMR1ShZDMy1lletxc2YrHRU MLfNRJxsbSMHXay72oB66Ptnzb8ZMG6Y6uQN8MkPoC630sx/2Ck6JqGpdo6SpmmK7h5Ve/rIZ1wb xXLAasCzfIeMa9fKgdL3xbt/igPbMkd3ZJvwjdy2AA7Ush+/3nxz/AIAAP//AwBQSwMEFAAGAAgA AAAhAD6L9189AgAAeQQAAA4AAABkcnMvZTJvRG9jLnhtbKxU227bMAx9H7B/EPS+2s6SpjXqFEUv w4DuAnTDnhVZtoXJokYpcbKvHyU7l21vw2JAEEXxkIdHzM3trjdsq9BrsBUvLnLOlJVQa9tW/OuX pzdXnPkgbC0MWFXxvfL8dvX61c3gSjWDDkytkBGI9eXgKt6F4Mos87JTvfAX4JQlZwPYi0AmtlmN YiD03mSzPL/MBsDaIUjlPZ0+jE6+SvhNo2T41DReBWYqTrWFtGJa12nNVjeibFG4TsupDvEPZfRC W8p6hHoQQbAN6r+gei0RPDThQkKfQdNoqRIJolPkf9B56YRTiQx1x7tjn/z/g5Ufty/uM8bSvXsG +d0zC/edsK26Q4ShU6KmdAVn1KlscL48RkTDUyxbDx+gJnHFJkBqwq7BPiISPbZLbd6fmq12gUk6 nReXxXw5W3AmyVvMlqRPzCHKQ7hDH94p6FncVBxJzQQvts8+THcPd2I6C0/amOgQpbFsqPj1gvCj SQrXyYkQvunQpc7GmpLTE964YQ6I7XjssV3fG2RbQY/nLo/focLWn18v8vhLUL/FPL6N33kMkWsP yYy2jNpc8cV8jJ8YHUqNGXodaDyM7it+dbokyqjKo61HqkFoMxmEb+ykU5QmzoEv11DvSSainlSg caVNB/iTs4FefsX9j41AxZl5b4n9dTGfx1lJxnyxnJGB5571uUdYSVAVD5zYxO19GOdr41C3HWUq Umcs3NHzaPQo3KmsqVp63kn7aRTj/Jzb6dbpH2P1CwAA//8DAFBLAwQUAAYACAAAACEApvkTOdwA AAAIAQAADwAAAGRycy9kb3ducmV2LnhtbEyPwU7DMBBE70j9B2srcaNOi6ggjVOlQK+VKEjAzY0X O2q8jmK3CX/PwqVcRhqNdnZesR59K87YxyaQgvksA4FUB9OQVfD2ur25BxGTJqPbQKjgGyOsy8lV oXMTBnrB8z5ZwSUUc63ApdTlUsbaoddxFjokzr5C73Vi21tpej1wuW/lIsuW0uuG+IPTHT46rI/7 k1fw3H3uqjsbZfWe3McxbIat21mlrqfj04qlWoFIOKbLBfwy8H4oedghnMhE0SpgmvSnnD3cLtke FCxAyLKQ/wHKHwAAAP//AwBQSwECLQAUAAYACAAAACEAWiKTo/8AAADlAQAAEwAAAAAAAAAAAAAA AAAAAAAAW0NvbnRlbnRfVHlwZXNdLnhtbFBLAQItABQABgAIAAAAIQCnSs841wAAAJYBAAALAAAA AAAAAAAAAAAAADABAABfcmVscy8ucmVsc1BLAQItABQABgAIAAAAIQA+i/dfPQIAAHkEAAAOAAAA AAAAAAAAAAAAADACAABkcnMvZTJvRG9jLnhtbFBLAQItABQABgAIAAAAIQCm+RM53AAAAAgBAAAP AAAAAAAAAAAAAAAAAJkEAABkcnMvZG93bnJldi54bWxQSwUGAAAAAAQABADzAAAAogUAAAAA " filled="f">
                 <w10:anchorlock/>
               </v:rect>
             </w:pict>
@@ -924,7 +918,7 @@
           </mc:Choice>
           <mc:Fallback>
             <w:pict>
-              <v:rect w14:anchorId="03C30D10" id="Rectangle 22" o:spid="_x0000_s1026" style="width:468pt;height:.1pt;visibility:visible;mso-wrap-style:square;mso-left-percent:-10001;mso-top-percent:-10001;mso-position-horizontal:absolute;mso-position-horizontal-relative:char;mso-position-vertical:absolute;mso-position-vertical-relative:line;mso-left-percent:-10001;mso-top-percent:-10001;v-text-anchor:top" o:gfxdata="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" filled="f">
+              <v:rect w14:anchorId="03C30D10" id="Rectangle 22" o:spid="_x0000_s1026" style="width:468pt;height:.1pt;visibility:visible;mso-wrap-style:square;mso-left-percent:-10001;mso-top-percent:-10001;mso-position-horizontal:absolute;mso-position-horizontal-relative:char;mso-position-vertical:absolute;mso-position-vertical-relative:line;mso-left-percent:-10001;mso-top-percent:-10001;v-text-anchor:top" o:gfxdata="UEsDBBQABgAIAAAAIQBaIpOj/wAAAOUBAAATAAAAW0NvbnRlbnRfVHlwZXNdLnhtbJSRQU7DMBBF 90jcwZotSpx2gRBK0gVpl4BQOYBlTxKLZGx5TGhvj5NCF4gisbRn/n9Pdrk5jIOYMLB1VMEqL0Ag aWcsdRW87nfZHQiOiowaHGEFR2TY1NdX5f7okUVKE1fQx+jvpWTd46g4dx4pTVoXRhXTMXTSK/2m OpTroriV2lFEilmcO6AuG2zV+xDF9pCuTyYBBwbxcFqcWRUo7werVUymciLzg5J9EfKUXHa4t55v kgYI+StiGV0kfAef0uMEa1A8qxAf1ZhEpAksce0ap/O/S2bNkTPXtlZj3gTeLqmz1aVy4z4o4PTf 9ibFXnA618vlk+pPAAAA//8DAFBLAwQUAAYACAAAACEAp0rPONcAAACWAQAACwAAAF9yZWxzLy5y ZWxzpJDBasMwDIbvg72D0X1xmsMYo04vo9Br6R7A2IpjGltGMtn69jM7jGX0tqN+oe/70f7wmRa1 IkukbGDX9aAwO/IxBwPvl+PTCyipNnu7UEYDNxQ4jI8P+zMutrYjmWMR1ShZDMy1lletxc2YrHRU MLfNRJxsbSMHXay72oB66Ptnzb8ZMG6Y6uQN8MkPoC630sx/2Ck6JqGpdo6SpmmK7h5Ve/rIZ1wb xXLAasCzfIeMa9fKgdL3xbt/igPbMkd3ZJvwjdy2AA7Ush+/3nxz/AIAAP//AwBQSwMEFAAGAAgA AAAhAD6L9189AgAAeQQAAA4AAABkcnMvZTJvRG9jLnhtbKxU227bMAx9H7B/EPS+2s6SpjXqFEUv w4DuAnTDnhVZtoXJokYpcbKvHyU7l21vw2JAEEXxkIdHzM3trjdsq9BrsBUvLnLOlJVQa9tW/OuX pzdXnPkgbC0MWFXxvfL8dvX61c3gSjWDDkytkBGI9eXgKt6F4Mos87JTvfAX4JQlZwPYi0AmtlmN YiD03mSzPL/MBsDaIUjlPZ0+jE6+SvhNo2T41DReBWYqTrWFtGJa12nNVjeibFG4TsupDvEPZfRC W8p6hHoQQbAN6r+gei0RPDThQkKfQdNoqRIJolPkf9B56YRTiQx1x7tjn/z/g5Ufty/uM8bSvXsG +d0zC/edsK26Q4ShU6KmdAVn1KlscL48RkTDUyxbDx+gJnHFJkBqwq7BPiISPbZLbd6fmq12gUk6 nReXxXw5W3AmyVvMlqRPzCHKQ7hDH94p6FncVBxJzQQvts8+THcPd2I6C0/amOgQpbFsqPj1gvCj SQrXyYkQvunQpc7GmpLTE964YQ6I7XjssV3fG2RbQY/nLo/focLWn18v8vhLUL/FPL6N33kMkWsP yYy2jNpc8cV8jJ8YHUqNGXodaDyM7it+dbokyqjKo61HqkFoMxmEb+ykU5QmzoEv11DvSSainlSg caVNB/iTs4FefsX9j41AxZl5b4n9dTGfx1lJxnyxnJGB5571uUdYSVAVD5zYxO19GOdr41C3HWUq Umcs3NHzaPQo3KmsqVp63kn7aRTj/Jzb6dbpH2P1CwAA//8DAFBLAwQUAAYACAAAACEApvkTOdwA AAAIAQAADwAAAGRycy9kb3ducmV2LnhtbEyPwU7DMBBE70j9B2srcaNOi6ggjVOlQK+VKEjAzY0X O2q8jmK3CX/PwqVcRhqNdnZesR59K87YxyaQgvksA4FUB9OQVfD2ur25BxGTJqPbQKjgGyOsy8lV oXMTBnrB8z5ZwSUUc63ApdTlUsbaoddxFjokzr5C73Vi21tpej1wuW/lIsuW0uuG+IPTHT46rI/7 k1fw3H3uqjsbZfWe3McxbIat21mlrqfj04qlWoFIOKbLBfwy8H4oedghnMhE0SpgmvSnnD3cLtke FCxAyLKQ/wHKHwAAAP//AwBQSwECLQAUAAYACAAAACEAWiKTo/8AAADlAQAAEwAAAAAAAAAAAAAA AAAAAAAAW0NvbnRlbnRfVHlwZXNdLnhtbFBLAQItABQABgAIAAAAIQCnSs841wAAAJYBAAALAAAA AAAAAAAAAAAAADABAABfcmVscy8ucmVsc1BLAQItABQABgAIAAAAIQA+i/dfPQIAAHkEAAAOAAAA AAAAAAAAAAAAADACAABkcnMvZTJvRG9jLnhtbFBLAQItABQABgAIAAAAIQCm+RM53AAAAAgBAAAP AAAAAAAAAAAAAAAAAJkEAABkcnMvZG93bnJldi54bWxQSwUGAAAAAAQABADzAAAAogUAAAAA " filled="f">
                 <w10:anchorlock/>
               </v:rect>
             </w:pict>
@@ -1139,7 +1133,7 @@
           </mc:Choice>
           <mc:Fallback>
             <w:pict>
-              <v:rect w14:anchorId="215C6418" id="Rectangle 21" o:spid="_x0000_s1026" style="width:468pt;height:.1pt;visibility:visible;mso-wrap-style:square;mso-left-percent:-10001;mso-top-percent:-10001;mso-position-horizontal:absolute;mso-position-horizontal-relative:char;mso-position-vertical:absolute;mso-position-vertical-relative:line;mso-left-percent:-10001;mso-top-percent:-10001;v-text-anchor:top" o:gfxdata="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" filled="f">
+              <v:rect w14:anchorId="215C6418" id="Rectangle 21" o:spid="_x0000_s1026" style="width:468pt;height:.1pt;visibility:visible;mso-wrap-style:square;mso-left-percent:-10001;mso-top-percent:-10001;mso-position-horizontal:absolute;mso-position-horizontal-relative:char;mso-position-vertical:absolute;mso-position-vertical-relative:line;mso-left-percent:-10001;mso-top-percent:-10001;v-text-anchor:top" o:gfxdata="UEsDBBQABgAIAAAAIQBaIpOj/wAAAOUBAAATAAAAW0NvbnRlbnRfVHlwZXNdLnhtbJSRQU7DMBBF 90jcwZotSpx2gRBK0gVpl4BQOYBlTxKLZGx5TGhvj5NCF4gisbRn/n9Pdrk5jIOYMLB1VMEqL0Ag aWcsdRW87nfZHQiOiowaHGEFR2TY1NdX5f7okUVKE1fQx+jvpWTd46g4dx4pTVoXRhXTMXTSK/2m OpTroriV2lFEilmcO6AuG2zV+xDF9pCuTyYBBwbxcFqcWRUo7werVUymciLzg5J9EfKUXHa4t55v kgYI+StiGV0kfAef0uMEa1A8qxAf1ZhEpAksce0ap/O/S2bNkTPXtlZj3gTeLqmz1aVy4z4o4PTf 9ibFXnA618vlk+pPAAAA//8DAFBLAwQUAAYACAAAACEAp0rPONcAAACWAQAACwAAAF9yZWxzLy5y ZWxzpJDBasMwDIbvg72D0X1xmsMYo04vo9Br6R7A2IpjGltGMtn69jM7jGX0tqN+oe/70f7wmRa1 IkukbGDX9aAwO/IxBwPvl+PTCyipNnu7UEYDNxQ4jI8P+zMutrYjmWMR1ShZDMy1lletxc2YrHRU MLfNRJxsbSMHXay72oB66Ptnzb8ZMG6Y6uQN8MkPoC630sx/2Ck6JqGpdo6SpmmK7h5Ve/rIZ1wb xXLAasCzfIeMa9fKgdL3xbt/igPbMkd3ZJvwjdy2AA7Ush+/3nxz/AIAAP//AwBQSwMEFAAGAAgA AAAhAD6L9189AgAAeQQAAA4AAABkcnMvZTJvRG9jLnhtbKxU227bMAx9H7B/EPS+2s6SpjXqFEUv w4DuAnTDnhVZtoXJokYpcbKvHyU7l21vw2JAEEXxkIdHzM3trjdsq9BrsBUvLnLOlJVQa9tW/OuX pzdXnPkgbC0MWFXxvfL8dvX61c3gSjWDDkytkBGI9eXgKt6F4Mos87JTvfAX4JQlZwPYi0AmtlmN YiD03mSzPL/MBsDaIUjlPZ0+jE6+SvhNo2T41DReBWYqTrWFtGJa12nNVjeibFG4TsupDvEPZfRC W8p6hHoQQbAN6r+gei0RPDThQkKfQdNoqRIJolPkf9B56YRTiQx1x7tjn/z/g5Ufty/uM8bSvXsG +d0zC/edsK26Q4ShU6KmdAVn1KlscL48RkTDUyxbDx+gJnHFJkBqwq7BPiISPbZLbd6fmq12gUk6 nReXxXw5W3AmyVvMlqRPzCHKQ7hDH94p6FncVBxJzQQvts8+THcPd2I6C0/amOgQpbFsqPj1gvCj SQrXyYkQvunQpc7GmpLTE964YQ6I7XjssV3fG2RbQY/nLo/focLWn18v8vhLUL/FPL6N33kMkWsP yYy2jNpc8cV8jJ8YHUqNGXodaDyM7it+dbokyqjKo61HqkFoMxmEb+ykU5QmzoEv11DvSSainlSg caVNB/iTs4FefsX9j41AxZl5b4n9dTGfx1lJxnyxnJGB5571uUdYSVAVD5zYxO19GOdr41C3HWUq Umcs3NHzaPQo3KmsqVp63kn7aRTj/Jzb6dbpH2P1CwAA//8DAFBLAwQUAAYACAAAACEApvkTOdwA AAAIAQAADwAAAGRycy9kb3ducmV2LnhtbEyPwU7DMBBE70j9B2srcaNOi6ggjVOlQK+VKEjAzY0X O2q8jmK3CX/PwqVcRhqNdnZesR59K87YxyaQgvksA4FUB9OQVfD2ur25BxGTJqPbQKjgGyOsy8lV oXMTBnrB8z5ZwSUUc63ApdTlUsbaoddxFjokzr5C73Vi21tpej1wuW/lIsuW0uuG+IPTHT46rI/7 k1fw3H3uqjsbZfWe3McxbIat21mlrqfj04qlWoFIOKbLBfwy8H4oedghnMhE0SpgmvSnnD3cLtke FCxAyLKQ/wHKHwAAAP//AwBQSwECLQAUAAYACAAAACEAWiKTo/8AAADlAQAAEwAAAAAAAAAAAAAA AAAAAAAAW0NvbnRlbnRfVHlwZXNdLnhtbFBLAQItABQABgAIAAAAIQCnSs841wAAAJYBAAALAAAA AAAAAAAAAAAAADABAABfcmVscy8ucmVsc1BLAQItABQABgAIAAAAIQA+i/dfPQIAAHkEAAAOAAAA AAAAAAAAAAAAADACAABkcnMvZTJvRG9jLnhtbFBLAQItABQABgAIAAAAIQCm+RM53AAAAAgBAAAP AAAAAAAAAAAAAAAAAJkEAABkcnMvZG93bnJldi54bWxQSwUGAAAAAAQABADzAAAAogUAAAAA " filled="f">
                 <w10:anchorlock/>
               </v:rect>
             </w:pict>
@@ -1402,7 +1396,7 @@
           </mc:Choice>
           <mc:Fallback>
             <w:pict>
-              <v:rect w14:anchorId="67D52193" id="Rectangle 20" o:spid="_x0000_s1026" style="width:468pt;height:.1pt;visibility:visible;mso-wrap-style:square;mso-left-percent:-10001;mso-top-percent:-10001;mso-position-horizontal:absolute;mso-position-horizontal-relative:char;mso-position-vertical:absolute;mso-position-vertical-relative:line;mso-left-percent:-10001;mso-top-percent:-10001;v-text-anchor:top" o:gfxdata="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" filled="f">
+              <v:rect w14:anchorId="67D52193" id="Rectangle 20" o:spid="_x0000_s1026" style="width:468pt;height:.1pt;visibility:visible;mso-wrap-style:square;mso-left-percent:-10001;mso-top-percent:-10001;mso-position-horizontal:absolute;mso-position-horizontal-relative:char;mso-position-vertical:absolute;mso-position-vertical-relative:line;mso-left-percent:-10001;mso-top-percent:-10001;v-text-anchor:top" o:gfxdata="UEsDBBQABgAIAAAAIQBaIpOj/wAAAOUBAAATAAAAW0NvbnRlbnRfVHlwZXNdLnhtbJSRQU7DMBBF 90jcwZotSpx2gRBK0gVpl4BQOYBlTxKLZGx5TGhvj5NCF4gisbRn/n9Pdrk5jIOYMLB1VMEqL0Ag aWcsdRW87nfZHQiOiowaHGEFR2TY1NdX5f7okUVKE1fQx+jvpWTd46g4dx4pTVoXRhXTMXTSK/2m OpTroriV2lFEilmcO6AuG2zV+xDF9pCuTyYBBwbxcFqcWRUo7werVUymciLzg5J9EfKUXHa4t55v kgYI+StiGV0kfAef0uMEa1A8qxAf1ZhEpAksce0ap/O/S2bNkTPXtlZj3gTeLqmz1aVy4z4o4PTf 9ibFXnA618vlk+pPAAAA//8DAFBLAwQUAAYACAAAACEAp0rPONcAAACWAQAACwAAAF9yZWxzLy5y ZWxzpJDBasMwDIbvg72D0X1xmsMYo04vo9Br6R7A2IpjGltGMtn69jM7jGX0tqN+oe/70f7wmRa1 IkukbGDX9aAwO/IxBwPvl+PTCyipNnu7UEYDNxQ4jI8P+zMutrYjmWMR1ShZDMy1lletxc2YrHRU MLfNRJxsbSMHXay72oB66Ptnzb8ZMG6Y6uQN8MkPoC630sx/2Ck6JqGpdo6SpmmK7h5Ve/rIZ1wb xXLAasCzfIeMa9fKgdL3xbt/igPbMkd3ZJvwjdy2AA7Ush+/3nxz/AIAAP//AwBQSwMEFAAGAAgA AAAhAD6L9189AgAAeQQAAA4AAABkcnMvZTJvRG9jLnhtbKxU227bMAx9H7B/EPS+2s6SpjXqFEUv w4DuAnTDnhVZtoXJokYpcbKvHyU7l21vw2JAEEXxkIdHzM3trjdsq9BrsBUvLnLOlJVQa9tW/OuX pzdXnPkgbC0MWFXxvfL8dvX61c3gSjWDDkytkBGI9eXgKt6F4Mos87JTvfAX4JQlZwPYi0AmtlmN YiD03mSzPL/MBsDaIUjlPZ0+jE6+SvhNo2T41DReBWYqTrWFtGJa12nNVjeibFG4TsupDvEPZfRC W8p6hHoQQbAN6r+gei0RPDThQkKfQdNoqRIJolPkf9B56YRTiQx1x7tjn/z/g5Ufty/uM8bSvXsG +d0zC/edsK26Q4ShU6KmdAVn1KlscL48RkTDUyxbDx+gJnHFJkBqwq7BPiISPbZLbd6fmq12gUk6 nReXxXw5W3AmyVvMlqRPzCHKQ7hDH94p6FncVBxJzQQvts8+THcPd2I6C0/amOgQpbFsqPj1gvCj SQrXyYkQvunQpc7GmpLTE964YQ6I7XjssV3fG2RbQY/nLo/focLWn18v8vhLUL/FPL6N33kMkWsP yYy2jNpc8cV8jJ8YHUqNGXodaDyM7it+dbokyqjKo61HqkFoMxmEb+ykU5QmzoEv11DvSSainlSg caVNB/iTs4FefsX9j41AxZl5b4n9dTGfx1lJxnyxnJGB5571uUdYSVAVD5zYxO19GOdr41C3HWUq Umcs3NHzaPQo3KmsqVp63kn7aRTj/Jzb6dbpH2P1CwAA//8DAFBLAwQUAAYACAAAACEApvkTOdwA AAAIAQAADwAAAGRycy9kb3ducmV2LnhtbEyPwU7DMBBE70j9B2srcaNOi6ggjVOlQK+VKEjAzY0X O2q8jmK3CX/PwqVcRhqNdnZesR59K87YxyaQgvksA4FUB9OQVfD2ur25BxGTJqPbQKjgGyOsy8lV oXMTBnrB8z5ZwSUUc63ApdTlUsbaoddxFjokzr5C73Vi21tpej1wuW/lIsuW0uuG+IPTHT46rI/7 k1fw3H3uqjsbZfWe3McxbIat21mlrqfj04qlWoFIOKbLBfwy8H4oedghnMhE0SpgmvSnnD3cLtke FCxAyLKQ/wHKHwAAAP//AwBQSwECLQAUAAYACAAAACEAWiKTo/8AAADlAQAAEwAAAAAAAAAAAAAA AAAAAAAAW0NvbnRlbnRfVHlwZXNdLnhtbFBLAQItABQABgAIAAAAIQCnSs841wAAAJYBAAALAAAA AAAAAAAAAAAAADABAABfcmVscy8ucmVsc1BLAQItABQABgAIAAAAIQA+i/dfPQIAAHkEAAAOAAAA AAAAAAAAAAAAADACAABkcnMvZTJvRG9jLnhtbFBLAQItABQABgAIAAAAIQCm+RM53AAAAAgBAAAP AAAAAAAAAAAAAAAAAJkEAABkcnMvZG93bnJldi54bWxQSwUGAAAAAAQABADzAAAAogUAAAAA " filled="f">
                 <w10:anchorlock/>
               </v:rect>
             </w:pict>
@@ -1622,7 +1616,7 @@
           </mc:Choice>
           <mc:Fallback>
             <w:pict>
-              <v:rect w14:anchorId="09BDA148" id="Rectangle 19" o:spid="_x0000_s1026" style="width:468pt;height:.1pt;visibility:visible;mso-wrap-style:square;mso-left-percent:-10001;mso-top-percent:-10001;mso-position-horizontal:absolute;mso-position-horizontal-relative:char;mso-position-vertical:absolute;mso-position-vertical-relative:line;mso-left-percent:-10001;mso-top-percent:-10001;v-text-anchor:top" o:gfxdata="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" filled="f">
+              <v:rect w14:anchorId="09BDA148" id="Rectangle 19" o:spid="_x0000_s1026" style="width:468pt;height:.1pt;visibility:visible;mso-wrap-style:square;mso-left-percent:-10001;mso-top-percent:-10001;mso-position-horizontal:absolute;mso-position-horizontal-relative:char;mso-position-vertical:absolute;mso-position-vertical-relative:line;mso-left-percent:-10001;mso-top-percent:-10001;v-text-anchor:top" o:gfxdata="UEsDBBQABgAIAAAAIQBaIpOj/wAAAOUBAAATAAAAW0NvbnRlbnRfVHlwZXNdLnhtbJSRQU7DMBBF 90jcwZotSpx2gRBK0gVpl4BQOYBlTxKLZGx5TGhvj5NCF4gisbRn/n9Pdrk5jIOYMLB1VMEqL0Ag aWcsdRW87nfZHQiOiowaHGEFR2TY1NdX5f7okUVKE1fQx+jvpWTd46g4dx4pTVoXRhXTMXTSK/2m OpTroriV2lFEilmcO6AuG2zV+xDF9pCuTyYBBwbxcFqcWRUo7werVUymciLzg5J9EfKUXHa4t55v kgYI+StiGV0kfAef0uMEa1A8qxAf1ZhEpAksce0ap/O/S2bNkTPXtlZj3gTeLqmz1aVy4z4o4PTf 9ibFXnA618vlk+pPAAAA//8DAFBLAwQUAAYACAAAACEAp0rPONcAAACWAQAACwAAAF9yZWxzLy5y ZWxzpJDBasMwDIbvg72D0X1xmsMYo04vo9Br6R7A2IpjGltGMtn69jM7jGX0tqN+oe/70f7wmRa1 IkukbGDX9aAwO/IxBwPvl+PTCyipNnu7UEYDNxQ4jI8P+zMutrYjmWMR1ShZDMy1lletxc2YrHRU MLfNRJxsbSMHXay72oB66Ptnzb8ZMG6Y6uQN8MkPoC630sx/2Ck6JqGpdo6SpmmK7h5Ve/rIZ1wb xXLAasCzfIeMa9fKgdL3xbt/igPbMkd3ZJvwjdy2AA7Ush+/3nxz/AIAAP//AwBQSwMEFAAGAAgA AAAhAD6L9189AgAAeQQAAA4AAABkcnMvZTJvRG9jLnhtbKxU227bMAx9H7B/EPS+2s6SpjXqFEUv w4DuAnTDnhVZtoXJokYpcbKvHyU7l21vw2JAEEXxkIdHzM3trjdsq9BrsBUvLnLOlJVQa9tW/OuX pzdXnPkgbC0MWFXxvfL8dvX61c3gSjWDDkytkBGI9eXgKt6F4Mos87JTvfAX4JQlZwPYi0AmtlmN YiD03mSzPL/MBsDaIUjlPZ0+jE6+SvhNo2T41DReBWYqTrWFtGJa12nNVjeibFG4TsupDvEPZfRC W8p6hHoQQbAN6r+gei0RPDThQkKfQdNoqRIJolPkf9B56YRTiQx1x7tjn/z/g5Ufty/uM8bSvXsG +d0zC/edsK26Q4ShU6KmdAVn1KlscL48RkTDUyxbDx+gJnHFJkBqwq7BPiISPbZLbd6fmq12gUk6 nReXxXw5W3AmyVvMlqRPzCHKQ7hDH94p6FncVBxJzQQvts8+THcPd2I6C0/amOgQpbFsqPj1gvCj SQrXyYkQvunQpc7GmpLTE964YQ6I7XjssV3fG2RbQY/nLo/focLWn18v8vhLUL/FPL6N33kMkWsP yYy2jNpc8cV8jJ8YHUqNGXodaDyM7it+dbokyqjKo61HqkFoMxmEb+ykU5QmzoEv11DvSSainlSg caVNB/iTs4FefsX9j41AxZl5b4n9dTGfx1lJxnyxnJGB5571uUdYSVAVD5zYxO19GOdr41C3HWUq Umcs3NHzaPQo3KmsqVp63kn7aRTj/Jzb6dbpH2P1CwAA//8DAFBLAwQUAAYACAAAACEApvkTOdwA AAAIAQAADwAAAGRycy9kb3ducmV2LnhtbEyPwU7DMBBE70j9B2srcaNOi6ggjVOlQK+VKEjAzY0X O2q8jmK3CX/PwqVcRhqNdnZesR59K87YxyaQgvksA4FUB9OQVfD2ur25BxGTJqPbQKjgGyOsy8lV oXMTBnrB8z5ZwSUUc63ApdTlUsbaoddxFjokzr5C73Vi21tpej1wuW/lIsuW0uuG+IPTHT46rI/7 k1fw3H3uqjsbZfWe3McxbIat21mlrqfj04qlWoFIOKbLBfwy8H4oedghnMhE0SpgmvSnnD3cLtke FCxAyLKQ/wHKHwAAAP//AwBQSwECLQAUAAYACAAAACEAWiKTo/8AAADlAQAAEwAAAAAAAAAAAAAA AAAAAAAAW0NvbnRlbnRfVHlwZXNdLnhtbFBLAQItABQABgAIAAAAIQCnSs841wAAAJYBAAALAAAA AAAAAAAAAAAAADABAABfcmVscy8ucmVsc1BLAQItABQABgAIAAAAIQA+i/dfPQIAAHkEAAAOAAAA AAAAAAAAAAAAADACAABkcnMvZTJvRG9jLnhtbFBLAQItABQABgAIAAAAIQCm+RM53AAAAAgBAAAP AAAAAAAAAAAAAAAAAJkEAABkcnMvZG93bnJldi54bWxQSwUGAAAAAAQABADzAAAAogUAAAAA " filled="f">
                 <w10:anchorlock/>
               </v:rect>
             </w:pict>
@@ -1916,7 +1910,7 @@
           </mc:Choice>
           <mc:Fallback>
             <w:pict>
-              <v:rect w14:anchorId="37FA1EB1" id="Rectangle 18" o:spid="_x0000_s1026" style="width:468pt;height:.1pt;visibility:visible;mso-wrap-style:square;mso-left-percent:-10001;mso-top-percent:-10001;mso-position-horizontal:absolute;mso-position-horizontal-relative:char;mso-position-vertical:absolute;mso-position-vertical-relative:line;mso-left-percent:-10001;mso-top-percent:-10001;v-text-anchor:top" o:gfxdata="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" filled="f">
+              <v:rect w14:anchorId="37FA1EB1" id="Rectangle 18" o:spid="_x0000_s1026" style="width:468pt;height:.1pt;visibility:visible;mso-wrap-style:square;mso-left-percent:-10001;mso-top-percent:-10001;mso-position-horizontal:absolute;mso-position-horizontal-relative:char;mso-position-vertical:absolute;mso-position-vertical-relative:line;mso-left-percent:-10001;mso-top-percent:-10001;v-text-anchor:top" o:gfxdata="UEsDBBQABgAIAAAAIQBaIpOj/wAAAOUBAAATAAAAW0NvbnRlbnRfVHlwZXNdLnhtbJSRQU7DMBBF 90jcwZotSpx2gRBK0gVpl4BQOYBlTxKLZGx5TGhvj5NCF4gisbRn/n9Pdrk5jIOYMLB1VMEqL0Ag aWcsdRW87nfZHQiOiowaHGEFR2TY1NdX5f7okUVKE1fQx+jvpWTd46g4dx4pTVoXRhXTMXTSK/2m OpTroriV2lFEilmcO6AuG2zV+xDF9pCuTyYBBwbxcFqcWRUo7werVUymciLzg5J9EfKUXHa4t55v kgYI+StiGV0kfAef0uMEa1A8qxAf1ZhEpAksce0ap/O/S2bNkTPXtlZj3gTeLqmz1aVy4z4o4PTf 9ibFXnA618vlk+pPAAAA//8DAFBLAwQUAAYACAAAACEAp0rPONcAAACWAQAACwAAAF9yZWxzLy5y ZWxzpJDBasMwDIbvg72D0X1xmsMYo04vo9Br6R7A2IpjGltGMtn69jM7jGX0tqN+oe/70f7wmRa1 IkukbGDX9aAwO/IxBwPvl+PTCyipNnu7UEYDNxQ4jI8P+zMutrYjmWMR1ShZDMy1lletxc2YrHRU MLfNRJxsbSMHXay72oB66Ptnzb8ZMG6Y6uQN8MkPoC630sx/2Ck6JqGpdo6SpmmK7h5Ve/rIZ1wb xXLAasCzfIeMa9fKgdL3xbt/igPbMkd3ZJvwjdy2AA7Ush+/3nxz/AIAAP//AwBQSwMEFAAGAAgA AAAhAD6L9189AgAAeQQAAA4AAABkcnMvZTJvRG9jLnhtbKxU227bMAx9H7B/EPS+2s6SpjXqFEUv w4DuAnTDnhVZtoXJokYpcbKvHyU7l21vw2JAEEXxkIdHzM3trjdsq9BrsBUvLnLOlJVQa9tW/OuX pzdXnPkgbC0MWFXxvfL8dvX61c3gSjWDDkytkBGI9eXgKt6F4Mos87JTvfAX4JQlZwPYi0AmtlmN YiD03mSzPL/MBsDaIUjlPZ0+jE6+SvhNo2T41DReBWYqTrWFtGJa12nNVjeibFG4TsupDvEPZfRC W8p6hHoQQbAN6r+gei0RPDThQkKfQdNoqRIJolPkf9B56YRTiQx1x7tjn/z/g5Ufty/uM8bSvXsG +d0zC/edsK26Q4ShU6KmdAVn1KlscL48RkTDUyxbDx+gJnHFJkBqwq7BPiISPbZLbd6fmq12gUk6 nReXxXw5W3AmyVvMlqRPzCHKQ7hDH94p6FncVBxJzQQvts8+THcPd2I6C0/amOgQpbFsqPj1gvCj SQrXyYkQvunQpc7GmpLTE964YQ6I7XjssV3fG2RbQY/nLo/focLWn18v8vhLUL/FPL6N33kMkWsP yYy2jNpc8cV8jJ8YHUqNGXodaDyM7it+dbokyqjKo61HqkFoMxmEb+ykU5QmzoEv11DvSSainlSg caVNB/iTs4FefsX9j41AxZl5b4n9dTGfx1lJxnyxnJGB5571uUdYSVAVD5zYxO19GOdr41C3HWUq Umcs3NHzaPQo3KmsqVp63kn7aRTj/Jzb6dbpH2P1CwAA//8DAFBLAwQUAAYACAAAACEApvkTOdwA AAAIAQAADwAAAGRycy9kb3ducmV2LnhtbEyPwU7DMBBE70j9B2srcaNOi6ggjVOlQK+VKEjAzY0X O2q8jmK3CX/PwqVcRhqNdnZesR59K87YxyaQgvksA4FUB9OQVfD2ur25BxGTJqPbQKjgGyOsy8lV oXMTBnrB8z5ZwSUUc63ApdTlUsbaoddxFjokzr5C73Vi21tpej1wuW/lIsuW0uuG+IPTHT46rI/7 k1fw3H3uqjsbZfWe3McxbIat21mlrqfj04qlWoFIOKbLBfwy8H4oedghnMhE0SpgmvSnnD3cLtke FCxAyLKQ/wHKHwAAAP//AwBQSwECLQAUAAYACAAAACEAWiKTo/8AAADlAQAAEwAAAAAAAAAAAAAA AAAAAAAAW0NvbnRlbnRfVHlwZXNdLnhtbFBLAQItABQABgAIAAAAIQCnSs841wAAAJYBAAALAAAA AAAAAAAAAAAAADABAABfcmVscy8ucmVsc1BLAQItABQABgAIAAAAIQA+i/dfPQIAAHkEAAAOAAAA AAAAAAAAAAAAADACAABkcnMvZTJvRG9jLnhtbFBLAQItABQABgAIAAAAIQCm+RM53AAAAAgBAAAP AAAAAAAAAAAAAAAAAJkEAABkcnMvZG93bnJldi54bWxQSwUGAAAAAAQABADzAAAAogUAAAAA " filled="f">
                 <w10:anchorlock/>
               </v:rect>
             </w:pict>
@@ -2209,7 +2203,7 @@
           </mc:Choice>
           <mc:Fallback>
             <w:pict>
-              <v:rect w14:anchorId="15651B0A" id="Rectangle 17" o:spid="_x0000_s1026" style="width:468pt;height:.1pt;visibility:visible;mso-wrap-style:square;mso-left-percent:-10001;mso-top-percent:-10001;mso-position-horizontal:absolute;mso-position-horizontal-relative:char;mso-position-vertical:absolute;mso-position-vertical-relative:line;mso-left-percent:-10001;mso-top-percent:-10001;v-text-anchor:top" o:gfxdata="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" filled="f">
+              <v:rect w14:anchorId="15651B0A" id="Rectangle 17" o:spid="_x0000_s1026" style="width:468pt;height:.1pt;visibility:visible;mso-wrap-style:square;mso-left-percent:-10001;mso-top-percent:-10001;mso-position-horizontal:absolute;mso-position-horizontal-relative:char;mso-position-vertical:absolute;mso-position-vertical-relative:line;mso-left-percent:-10001;mso-top-percent:-10001;v-text-anchor:top" o:gfxdata="UEsDBBQABgAIAAAAIQBaIpOj/wAAAOUBAAATAAAAW0NvbnRlbnRfVHlwZXNdLnhtbJSRQU7DMBBF 90jcwZotSpx2gRBK0gVpl4BQOYBlTxKLZGx5TGhvj5NCF4gisbRn/n9Pdrk5jIOYMLB1VMEqL0Ag aWcsdRW87nfZHQiOiowaHGEFR2TY1NdX5f7okUVKE1fQx+jvpWTd46g4dx4pTVoXRhXTMXTSK/2m OpTroriV2lFEilmcO6AuG2zV+xDF9pCuTyYBBwbxcFqcWRUo7werVUymciLzg5J9EfKUXHa4t55v kgYI+StiGV0kfAef0uMEa1A8qxAf1ZhEpAksce0ap/O/S2bNkTPXtlZj3gTeLqmz1aVy4z4o4PTf 9ibFXnA618vlk+pPAAAA//8DAFBLAwQUAAYACAAAACEAp0rPONcAAACWAQAACwAAAF9yZWxzLy5y ZWxzpJDBasMwDIbvg72D0X1xmsMYo04vo9Br6R7A2IpjGltGMtn69jM7jGX0tqN+oe/70f7wmRa1 IkukbGDX9aAwO/IxBwPvl+PTCyipNnu7UEYDNxQ4jI8P+zMutrYjmWMR1ShZDMy1lletxc2YrHRU MLfNRJxsbSMHXay72oB66Ptnzb8ZMG6Y6uQN8MkPoC630sx/2Ck6JqGpdo6SpmmK7h5Ve/rIZ1wb xXLAasCzfIeMa9fKgdL3xbt/igPbMkd3ZJvwjdy2AA7Ush+/3nxz/AIAAP//AwBQSwMEFAAGAAgA AAAhAD6L9189AgAAeQQAAA4AAABkcnMvZTJvRG9jLnhtbKxU227bMAx9H7B/EPS+2s6SpjXqFEUv w4DuAnTDnhVZtoXJokYpcbKvHyU7l21vw2JAEEXxkIdHzM3trjdsq9BrsBUvLnLOlJVQa9tW/OuX pzdXnPkgbC0MWFXxvfL8dvX61c3gSjWDDkytkBGI9eXgKt6F4Mos87JTvfAX4JQlZwPYi0AmtlmN YiD03mSzPL/MBsDaIUjlPZ0+jE6+SvhNo2T41DReBWYqTrWFtGJa12nNVjeibFG4TsupDvEPZfRC W8p6hHoQQbAN6r+gei0RPDThQkKfQdNoqRIJolPkf9B56YRTiQx1x7tjn/z/g5Ufty/uM8bSvXsG +d0zC/edsK26Q4ShU6KmdAVn1KlscL48RkTDUyxbDx+gJnHFJkBqwq7BPiISPbZLbd6fmq12gUk6 nReXxXw5W3AmyVvMlqRPzCHKQ7hDH94p6FncVBxJzQQvts8+THcPd2I6C0/amOgQpbFsqPj1gvCj SQrXyYkQvunQpc7GmpLTE964YQ6I7XjssV3fG2RbQY/nLo/focLWn18v8vhLUL/FPL6N33kMkWsP yYy2jNpc8cV8jJ8YHUqNGXodaDyM7it+dbokyqjKo61HqkFoMxmEb+ykU5QmzoEv11DvSSainlSg caVNB/iTs4FefsX9j41AxZl5b4n9dTGfx1lJxnyxnJGB5571uUdYSVAVD5zYxO19GOdr41C3HWUq Umcs3NHzaPQo3KmsqVp63kn7aRTj/Jzb6dbpH2P1CwAA//8DAFBLAwQUAAYACAAAACEApvkTOdwA AAAIAQAADwAAAGRycy9kb3ducmV2LnhtbEyPwU7DMBBE70j9B2srcaNOi6ggjVOlQK+VKEjAzY0X O2q8jmK3CX/PwqVcRhqNdnZesR59K87YxyaQgvksA4FUB9OQVfD2ur25BxGTJqPbQKjgGyOsy8lV oXMTBnrB8z5ZwSUUc63ApdTlUsbaoddxFjokzr5C73Vi21tpej1wuW/lIsuW0uuG+IPTHT46rI/7 k1fw3H3uqjsbZfWe3McxbIat21mlrqfj04qlWoFIOKbLBfwy8H4oedghnMhE0SpgmvSnnD3cLtke FCxAyLKQ/wHKHwAAAP//AwBQSwECLQAUAAYACAAAACEAWiKTo/8AAADlAQAAEwAAAAAAAAAAAAAA AAAAAAAAW0NvbnRlbnRfVHlwZXNdLnhtbFBLAQItABQABgAIAAAAIQCnSs841wAAAJYBAAALAAAA AAAAAAAAAAAAADABAABfcmVscy8ucmVsc1BLAQItABQABgAIAAAAIQA+i/dfPQIAAHkEAAAOAAAA AAAAAAAAAAAAADACAABkcnMvZTJvRG9jLnhtbFBLAQItABQABgAIAAAAIQCm+RM53AAAAAgBAAAP AAAAAAAAAAAAAAAAAJkEAABkcnMvZG93bnJldi54bWxQSwUGAAAAAAQABADzAAAAogUAAAAA " filled="f">
                 <w10:anchorlock/>
               </v:rect>
             </w:pict>
@@ -2339,8 +2333,6 @@
       </w:r>
       <w:r>
         <w:t xml:space="preserve"> Action Long</w:t>
-      </w:r>
-      <w:r>
         <w:br/>
       </w:r>
       <w:r>
@@ -2360,6 +2352,32 @@
       <w:r>
         <w:t>These behaviors may be renamed or reassigned as the physical control layout is finalized.</w:t>
       </w:r>
+    </w:p>
+    <w:p>
+      <w:pPr>
+        <w:pStyle w:val="NormalWeb"/>
+        <w:rPr>
+          <w:ins w:id="9100" w:author="Claude" w:date="2026-09-24T12:00:00Z"/>
+        </w:rPr>
+      </w:pPr>
+      <w:ins w:id="9101" w:author="Claude" w:date="2026-09-24T12:00:00Z">
+        <w:r>
+          <w:t xml:space="preserve">Each player can change how long Action must be held to pause and to claim a win. See </w:t>
+        </w:r>
+      </w:ins>
+      <w:ins w:id="9102" w:author="Claude" w:date="2026-09-24T12:00:00Z">
+        <w:r>
+          <w:rPr>
+            <w:rStyle w:val="Strong"/>
+          </w:rPr>
+          <w:t xml:space="preserve">Accessibility Settings</w:t>
+        </w:r>
+      </w:ins>
+      <w:ins w:id="9103" w:author="Claude" w:date="2026-09-24T12:00:00Z">
+        <w:r>
+          <w:t xml:space="preserve"> in section 13.</w:t>
+        </w:r>
+      </w:ins>
     </w:p>
     <w:p>
       <w:pPr>
@@ -2455,7 +2473,7 @@
           </mc:Choice>
           <mc:Fallback>
             <w:pict>
-              <v:rect w14:anchorId="0022DDC0" id="Rectangle 16" o:spid="_x0000_s1026" style="width:468pt;height:.1pt;visibility:visible;mso-wrap-style:square;mso-left-percent:-10001;mso-top-percent:-10001;mso-position-horizontal:absolute;mso-position-horizontal-relative:char;mso-position-vertical:absolute;mso-position-vertical-relative:line;mso-left-percent:-10001;mso-top-percent:-10001;v-text-anchor:top" o:gfxdata="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" filled="f">
+              <v:rect w14:anchorId="0022DDC0" id="Rectangle 16" o:spid="_x0000_s1026" style="width:468pt;height:.1pt;visibility:visible;mso-wrap-style:square;mso-left-percent:-10001;mso-top-percent:-10001;mso-position-horizontal:absolute;mso-position-horizontal-relative:char;mso-position-vertical:absolute;mso-position-vertical-relative:line;mso-left-percent:-10001;mso-top-percent:-10001;v-text-anchor:top" o:gfxdata="UEsDBBQABgAIAAAAIQBaIpOj/wAAAOUBAAATAAAAW0NvbnRlbnRfVHlwZXNdLnhtbJSRQU7DMBBF 90jcwZotSpx2gRBK0gVpl4BQOYBlTxKLZGx5TGhvj5NCF4gisbRn/n9Pdrk5jIOYMLB1VMEqL0Ag aWcsdRW87nfZHQiOiowaHGEFR2TY1NdX5f7okUVKE1fQx+jvpWTd46g4dx4pTVoXRhXTMXTSK/2m OpTroriV2lFEilmcO6AuG2zV+xDF9pCuTyYBBwbxcFqcWRUo7werVUymciLzg5J9EfKUXHa4t55v kgYI+StiGV0kfAef0uMEa1A8qxAf1ZhEpAksce0ap/O/S2bNkTPXtlZj3gTeLqmz1aVy4z4o4PTf 9ibFXnA618vlk+pPAAAA//8DAFBLAwQUAAYACAAAACEAp0rPONcAAACWAQAACwAAAF9yZWxzLy5y ZWxzpJDBasMwDIbvg72D0X1xmsMYo04vo9Br6R7A2IpjGltGMtn69jM7jGX0tqN+oe/70f7wmRa1 IkukbGDX9aAwO/IxBwPvl+PTCyipNnu7UEYDNxQ4jI8P+zMutrYjmWMR1ShZDMy1lletxc2YrHRU MLfNRJxsbSMHXay72oB66Ptnzb8ZMG6Y6uQN8MkPoC630sx/2Ck6JqGpdo6SpmmK7h5Ve/rIZ1wb xXLAasCzfIeMa9fKgdL3xbt/igPbMkd3ZJvwjdy2AA7Ush+/3nxz/AIAAP//AwBQSwMEFAAGAAgA AAAhAD6L9189AgAAeQQAAA4AAABkcnMvZTJvRG9jLnhtbKxU227bMAx9H7B/EPS+2s6SpjXqFEUv w4DuAnTDnhVZtoXJokYpcbKvHyU7l21vw2JAEEXxkIdHzM3trjdsq9BrsBUvLnLOlJVQa9tW/OuX pzdXnPkgbC0MWFXxvfL8dvX61c3gSjWDDkytkBGI9eXgKt6F4Mos87JTvfAX4JQlZwPYi0AmtlmN YiD03mSzPL/MBsDaIUjlPZ0+jE6+SvhNo2T41DReBWYqTrWFtGJa12nNVjeibFG4TsupDvEPZfRC W8p6hHoQQbAN6r+gei0RPDThQkKfQdNoqRIJolPkf9B56YRTiQx1x7tjn/z/g5Ufty/uM8bSvXsG +d0zC/edsK26Q4ShU6KmdAVn1KlscL48RkTDUyxbDx+gJnHFJkBqwq7BPiISPbZLbd6fmq12gUk6 nReXxXw5W3AmyVvMlqRPzCHKQ7hDH94p6FncVBxJzQQvts8+THcPd2I6C0/amOgQpbFsqPj1gvCj SQrXyYkQvunQpc7GmpLTE964YQ6I7XjssV3fG2RbQY/nLo/focLWn18v8vhLUL/FPL6N33kMkWsP yYy2jNpc8cV8jJ8YHUqNGXodaDyM7it+dbokyqjKo61HqkFoMxmEb+ykU5QmzoEv11DvSSainlSg caVNB/iTs4FefsX9j41AxZl5b4n9dTGfx1lJxnyxnJGB5571uUdYSVAVD5zYxO19GOdr41C3HWUq Umcs3NHzaPQo3KmsqVp63kn7aRTj/Jzb6dbpH2P1CwAA//8DAFBLAwQUAAYACAAAACEApvkTOdwA AAAIAQAADwAAAGRycy9kb3ducmV2LnhtbEyPwU7DMBBE70j9B2srcaNOi6ggjVOlQK+VKEjAzY0X O2q8jmK3CX/PwqVcRhqNdnZesR59K87YxyaQgvksA4FUB9OQVfD2ur25BxGTJqPbQKjgGyOsy8lV oXMTBnrB8z5ZwSUUc63ApdTlUsbaoddxFjokzr5C73Vi21tpej1wuW/lIsuW0uuG+IPTHT46rI/7 k1fw3H3uqjsbZfWe3McxbIat21mlrqfj04qlWoFIOKbLBfwy8H4oedghnMhE0SpgmvSnnD3cLtke FCxAyLKQ/wHKHwAAAP//AwBQSwECLQAUAAYACAAAACEAWiKTo/8AAADlAQAAEwAAAAAAAAAAAAAA AAAAAAAAW0NvbnRlbnRfVHlwZXNdLnhtbFBLAQItABQABgAIAAAAIQCnSs841wAAAJYBAAALAAAA AAAAAAAAAAAAADABAABfcmVscy8ucmVsc1BLAQItABQABgAIAAAAIQA+i/dfPQIAAHkEAAAOAAAA AAAAAAAAAAAAADACAABkcnMvZTJvRG9jLnhtbFBLAQItABQABgAIAAAAIQCm+RM53AAAAAgBAAAP AAAAAAAAAAAAAAAAAJkEAABkcnMvZG93bnJldi54bWxQSwUGAAAAAAQABADzAAAAogUAAAAA " filled="f">
                 <w10:anchorlock/>
               </v:rect>
             </w:pict>
@@ -2611,7 +2629,7 @@
           </mc:Choice>
           <mc:Fallback>
             <w:pict>
-              <v:rect w14:anchorId="6ADDDF33" id="Rectangle 15" o:spid="_x0000_s1026" style="width:468pt;height:.1pt;visibility:visible;mso-wrap-style:square;mso-left-percent:-10001;mso-top-percent:-10001;mso-position-horizontal:absolute;mso-position-horizontal-relative:char;mso-position-vertical:absolute;mso-position-vertical-relative:line;mso-left-percent:-10001;mso-top-percent:-10001;v-text-anchor:top" o:gfxdata="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" filled="f">
+              <v:rect w14:anchorId="6ADDDF33" id="Rectangle 15" o:spid="_x0000_s1026" style="width:468pt;height:.1pt;visibility:visible;mso-wrap-style:square;mso-left-percent:-10001;mso-top-percent:-10001;mso-position-horizontal:absolute;mso-position-horizontal-relative:char;mso-position-vertical:absolute;mso-position-vertical-relative:line;mso-left-percent:-10001;mso-top-percent:-10001;v-text-anchor:top" o:gfxdata="UEsDBBQABgAIAAAAIQBaIpOj/wAAAOUBAAATAAAAW0NvbnRlbnRfVHlwZXNdLnhtbJSRQU7DMBBF 90jcwZotSpx2gRBK0gVpl4BQOYBlTxKLZGx5TGhvj5NCF4gisbRn/n9Pdrk5jIOYMLB1VMEqL0Ag aWcsdRW87nfZHQiOiowaHGEFR2TY1NdX5f7okUVKE1fQx+jvpWTd46g4dx4pTVoXRhXTMXTSK/2m OpTroriV2lFEilmcO6AuG2zV+xDF9pCuTyYBBwbxcFqcWRUo7werVUymciLzg5J9EfKUXHa4t55v kgYI+StiGV0kfAef0uMEa1A8qxAf1ZhEpAksce0ap/O/S2bNkTPXtlZj3gTeLqmz1aVy4z4o4PTf 9ibFXnA618vlk+pPAAAA//8DAFBLAwQUAAYACAAAACEAp0rPONcAAACWAQAACwAAAF9yZWxzLy5y ZWxzpJDBasMwDIbvg72D0X1xmsMYo04vo9Br6R7A2IpjGltGMtn69jM7jGX0tqN+oe/70f7wmRa1 IkukbGDX9aAwO/IxBwPvl+PTCyipNnu7UEYDNxQ4jI8P+zMutrYjmWMR1ShZDMy1lletxc2YrHRU MLfNRJxsbSMHXay72oB66Ptnzb8ZMG6Y6uQN8MkPoC630sx/2Ck6JqGpdo6SpmmK7h5Ve/rIZ1wb xXLAasCzfIeMa9fKgdL3xbt/igPbMkd3ZJvwjdy2AA7Ush+/3nxz/AIAAP//AwBQSwMEFAAGAAgA AAAhAD6L9189AgAAeQQAAA4AAABkcnMvZTJvRG9jLnhtbKxU227bMAx9H7B/EPS+2s6SpjXqFEUv w4DuAnTDnhVZtoXJokYpcbKvHyU7l21vw2JAEEXxkIdHzM3trjdsq9BrsBUvLnLOlJVQa9tW/OuX pzdXnPkgbC0MWFXxvfL8dvX61c3gSjWDDkytkBGI9eXgKt6F4Mos87JTvfAX4JQlZwPYi0AmtlmN YiD03mSzPL/MBsDaIUjlPZ0+jE6+SvhNo2T41DReBWYqTrWFtGJa12nNVjeibFG4TsupDvEPZfRC W8p6hHoQQbAN6r+gei0RPDThQkKfQdNoqRIJolPkf9B56YRTiQx1x7tjn/z/g5Ufty/uM8bSvXsG +d0zC/edsK26Q4ShU6KmdAVn1KlscL48RkTDUyxbDx+gJnHFJkBqwq7BPiISPbZLbd6fmq12gUk6 nReXxXw5W3AmyVvMlqRPzCHKQ7hDH94p6FncVBxJzQQvts8+THcPd2I6C0/amOgQpbFsqPj1gvCj SQrXyYkQvunQpc7GmpLTE964YQ6I7XjssV3fG2RbQY/nLo/focLWn18v8vhLUL/FPL6N33kMkWsP yYy2jNpc8cV8jJ8YHUqNGXodaDyM7it+dbokyqjKo61HqkFoMxmEb+ykU5QmzoEv11DvSSainlSg caVNB/iTs4FefsX9j41AxZl5b4n9dTGfx1lJxnyxnJGB5571uUdYSVAVD5zYxO19GOdr41C3HWUq Umcs3NHzaPQo3KmsqVp63kn7aRTj/Jzb6dbpH2P1CwAA//8DAFBLAwQUAAYACAAAACEApvkTOdwA AAAIAQAADwAAAGRycy9kb3ducmV2LnhtbEyPwU7DMBBE70j9B2srcaNOi6ggjVOlQK+VKEjAzY0X O2q8jmK3CX/PwqVcRhqNdnZesR59K87YxyaQgvksA4FUB9OQVfD2ur25BxGTJqPbQKjgGyOsy8lV oXMTBnrB8z5ZwSUUc63ApdTlUsbaoddxFjokzr5C73Vi21tpej1wuW/lIsuW0uuG+IPTHT46rI/7 k1fw3H3uqjsbZfWe3McxbIat21mlrqfj04qlWoFIOKbLBfwy8H4oedghnMhE0SpgmvSnnD3cLtke FCxAyLKQ/wHKHwAAAP//AwBQSwECLQAUAAYACAAAACEAWiKTo/8AAADlAQAAEwAAAAAAAAAAAAAA AAAAAAAAW0NvbnRlbnRfVHlwZXNdLnhtbFBLAQItABQABgAIAAAAIQCnSs841wAAAJYBAAALAAAA AAAAAAAAAAAAADABAABfcmVscy8ucmVsc1BLAQItABQABgAIAAAAIQA+i/dfPQIAAHkEAAAOAAAA AAAAAAAAAAAAADACAABkcnMvZTJvRG9jLnhtbFBLAQItABQABgAIAAAAIQCm+RM53AAAAAgBAAAP AAAAAAAAAAAAAAAAAJkEAABkcnMvZG93bnJldi54bWxQSwUGAAAAAAQABADzAAAAogUAAAAA " filled="f">
                 <w10:anchorlock/>
               </v:rect>
             </w:pict>
@@ -2721,7 +2739,7 @@
           </mc:Choice>
           <mc:Fallback>
             <w:pict>
-              <v:rect w14:anchorId="4A418791" id="Rectangle 14" o:spid="_x0000_s1026" style="width:468pt;height:.1pt;visibility:visible;mso-wrap-style:square;mso-left-percent:-10001;mso-top-percent:-10001;mso-position-horizontal:absolute;mso-position-horizontal-relative:char;mso-position-vertical:absolute;mso-position-vertical-relative:line;mso-left-percent:-10001;mso-top-percent:-10001;v-text-anchor:top" o:gfxdata="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" filled="f">
+              <v:rect w14:anchorId="4A418791" id="Rectangle 14" o:spid="_x0000_s1026" style="width:468pt;height:.1pt;visibility:visible;mso-wrap-style:square;mso-left-percent:-10001;mso-top-percent:-10001;mso-position-horizontal:absolute;mso-position-horizontal-relative:char;mso-position-vertical:absolute;mso-position-vertical-relative:line;mso-left-percent:-10001;mso-top-percent:-10001;v-text-anchor:top" o:gfxdata="UEsDBBQABgAIAAAAIQBaIpOj/wAAAOUBAAATAAAAW0NvbnRlbnRfVHlwZXNdLnhtbJSRQU7DMBBF 90jcwZotSpx2gRBK0gVpl4BQOYBlTxKLZGx5TGhvj5NCF4gisbRn/n9Pdrk5jIOYMLB1VMEqL0Ag aWcsdRW87nfZHQiOiowaHGEFR2TY1NdX5f7okUVKE1fQx+jvpWTd46g4dx4pTVoXRhXTMXTSK/2m OpTroriV2lFEilmcO6AuG2zV+xDF9pCuTyYBBwbxcFqcWRUo7werVUymciLzg5J9EfKUXHa4t55v kgYI+StiGV0kfAef0uMEa1A8qxAf1ZhEpAksce0ap/O/S2bNkTPXtlZj3gTeLqmz1aVy4z4o4PTf 9ibFXnA618vlk+pPAAAA//8DAFBLAwQUAAYACAAAACEAp0rPONcAAACWAQAACwAAAF9yZWxzLy5y ZWxzpJDBasMwDIbvg72D0X1xmsMYo04vo9Br6R7A2IpjGltGMtn69jM7jGX0tqN+oe/70f7wmRa1 IkukbGDX9aAwO/IxBwPvl+PTCyipNnu7UEYDNxQ4jI8P+zMutrYjmWMR1ShZDMy1lletxc2YrHRU MLfNRJxsbSMHXay72oB66Ptnzb8ZMG6Y6uQN8MkPoC630sx/2Ck6JqGpdo6SpmmK7h5Ve/rIZ1wb xXLAasCzfIeMa9fKgdL3xbt/igPbMkd3ZJvwjdy2AA7Ush+/3nxz/AIAAP//AwBQSwMEFAAGAAgA AAAhAD6L9189AgAAeQQAAA4AAABkcnMvZTJvRG9jLnhtbKxU227bMAx9H7B/EPS+2s6SpjXqFEUv w4DuAnTDnhVZtoXJokYpcbKvHyU7l21vw2JAEEXxkIdHzM3trjdsq9BrsBUvLnLOlJVQa9tW/OuX pzdXnPkgbC0MWFXxvfL8dvX61c3gSjWDDkytkBGI9eXgKt6F4Mos87JTvfAX4JQlZwPYi0AmtlmN YiD03mSzPL/MBsDaIUjlPZ0+jE6+SvhNo2T41DReBWYqTrWFtGJa12nNVjeibFG4TsupDvEPZfRC W8p6hHoQQbAN6r+gei0RPDThQkKfQdNoqRIJolPkf9B56YRTiQx1x7tjn/z/g5Ufty/uM8bSvXsG +d0zC/edsK26Q4ShU6KmdAVn1KlscL48RkTDUyxbDx+gJnHFJkBqwq7BPiISPbZLbd6fmq12gUk6 nReXxXw5W3AmyVvMlqRPzCHKQ7hDH94p6FncVBxJzQQvts8+THcPd2I6C0/amOgQpbFsqPj1gvCj SQrXyYkQvunQpc7GmpLTE964YQ6I7XjssV3fG2RbQY/nLo/focLWn18v8vhLUL/FPL6N33kMkWsP yYy2jNpc8cV8jJ8YHUqNGXodaDyM7it+dbokyqjKo61HqkFoMxmEb+ykU5QmzoEv11DvSSainlSg caVNB/iTs4FefsX9j41AxZl5b4n9dTGfx1lJxnyxnJGB5571uUdYSVAVD5zYxO19GOdr41C3HWUq Umcs3NHzaPQo3KmsqVp63kn7aRTj/Jzb6dbpH2P1CwAA//8DAFBLAwQUAAYACAAAACEApvkTOdwA AAAIAQAADwAAAGRycy9kb3ducmV2LnhtbEyPwU7DMBBE70j9B2srcaNOi6ggjVOlQK+VKEjAzY0X O2q8jmK3CX/PwqVcRhqNdnZesR59K87YxyaQgvksA4FUB9OQVfD2ur25BxGTJqPbQKjgGyOsy8lV oXMTBnrB8z5ZwSUUc63ApdTlUsbaoddxFjokzr5C73Vi21tpej1wuW/lIsuW0uuG+IPTHT46rI/7 k1fw3H3uqjsbZfWe3McxbIat21mlrqfj04qlWoFIOKbLBfwy8H4oedghnMhE0SpgmvSnnD3cLtke FCxAyLKQ/wHKHwAAAP//AwBQSwECLQAUAAYACAAAACEAWiKTo/8AAADlAQAAEwAAAAAAAAAAAAAA AAAAAAAAW0NvbnRlbnRfVHlwZXNdLnhtbFBLAQItABQABgAIAAAAIQCnSs841wAAAJYBAAALAAAA AAAAAAAAAAAAADABAABfcmVscy8ucmVsc1BLAQItABQABgAIAAAAIQA+i/dfPQIAAHkEAAAOAAAA AAAAAAAAAAAAADACAABkcnMvZTJvRG9jLnhtbFBLAQItABQABgAIAAAAIQCm+RM53AAAAAgBAAAP AAAAAAAAAAAAAAAAAJkEAABkcnMvZG93bnJldi54bWxQSwUGAAAAAAQABADzAAAAogUAAAAA " filled="f">
                 <w10:anchorlock/>
               </v:rect>
             </w:pict>
@@ -2894,7 +2912,7 @@
           </mc:Choice>
           <mc:Fallback>
             <w:pict>
-              <v:rect w14:anchorId="2BB96FB2" id="Rectangle 13" o:spid="_x0000_s1026" style="width:468pt;height:.1pt;visibility:visible;mso-wrap-style:square;mso-left-percent:-10001;mso-top-percent:-10001;mso-position-horizontal:absolute;mso-position-horizontal-relative:char;mso-position-vertical:absolute;mso-position-vertical-relative:line;mso-left-percent:-10001;mso-top-percent:-10001;v-text-anchor:top" o:gfxdata="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" filled="f">
+              <v:rect w14:anchorId="2BB96FB2" id="Rectangle 13" o:spid="_x0000_s1026" style="width:468pt;height:.1pt;visibility:visible;mso-wrap-style:square;mso-left-percent:-10001;mso-top-percent:-10001;mso-position-horizontal:absolute;mso-position-horizontal-relative:char;mso-position-vertical:absolute;mso-position-vertical-relative:line;mso-left-percent:-10001;mso-top-percent:-10001;v-text-anchor:top" o:gfxdata="UEsDBBQABgAIAAAAIQBaIpOj/wAAAOUBAAATAAAAW0NvbnRlbnRfVHlwZXNdLnhtbJSRQU7DMBBF 90jcwZotSpx2gRBK0gVpl4BQOYBlTxKLZGx5TGhvj5NCF4gisbRn/n9Pdrk5jIOYMLB1VMEqL0Ag aWcsdRW87nfZHQiOiowaHGEFR2TY1NdX5f7okUVKE1fQx+jvpWTd46g4dx4pTVoXRhXTMXTSK/2m OpTroriV2lFEilmcO6AuG2zV+xDF9pCuTyYBBwbxcFqcWRUo7werVUymciLzg5J9EfKUXHa4t55v kgYI+StiGV0kfAef0uMEa1A8qxAf1ZhEpAksce0ap/O/S2bNkTPXtlZj3gTeLqmz1aVy4z4o4PTf 9ibFXnA618vlk+pPAAAA//8DAFBLAwQUAAYACAAAACEAp0rPONcAAACWAQAACwAAAF9yZWxzLy5y ZWxzpJDBasMwDIbvg72D0X1xmsMYo04vo9Br6R7A2IpjGltGMtn69jM7jGX0tqN+oe/70f7wmRa1 IkukbGDX9aAwO/IxBwPvl+PTCyipNnu7UEYDNxQ4jI8P+zMutrYjmWMR1ShZDMy1lletxc2YrHRU MLfNRJxsbSMHXay72oB66Ptnzb8ZMG6Y6uQN8MkPoC630sx/2Ck6JqGpdo6SpmmK7h5Ve/rIZ1wb xXLAasCzfIeMa9fKgdL3xbt/igPbMkd3ZJvwjdy2AA7Ush+/3nxz/AIAAP//AwBQSwMEFAAGAAgA AAAhAD6L9189AgAAeQQAAA4AAABkcnMvZTJvRG9jLnhtbKxU227bMAx9H7B/EPS+2s6SpjXqFEUv w4DuAnTDnhVZtoXJokYpcbKvHyU7l21vw2JAEEXxkIdHzM3trjdsq9BrsBUvLnLOlJVQa9tW/OuX pzdXnPkgbC0MWFXxvfL8dvX61c3gSjWDDkytkBGI9eXgKt6F4Mos87JTvfAX4JQlZwPYi0AmtlmN YiD03mSzPL/MBsDaIUjlPZ0+jE6+SvhNo2T41DReBWYqTrWFtGJa12nNVjeibFG4TsupDvEPZfRC W8p6hHoQQbAN6r+gei0RPDThQkKfQdNoqRIJolPkf9B56YRTiQx1x7tjn/z/g5Ufty/uM8bSvXsG +d0zC/edsK26Q4ShU6KmdAVn1KlscL48RkTDUyxbDx+gJnHFJkBqwq7BPiISPbZLbd6fmq12gUk6 nReXxXw5W3AmyVvMlqRPzCHKQ7hDH94p6FncVBxJzQQvts8+THcPd2I6C0/amOgQpbFsqPj1gvCj SQrXyYkQvunQpc7GmpLTE964YQ6I7XjssV3fG2RbQY/nLo/focLWn18v8vhLUL/FPL6N33kMkWsP yYy2jNpc8cV8jJ8YHUqNGXodaDyM7it+dbokyqjKo61HqkFoMxmEb+ykU5QmzoEv11DvSSainlSg caVNB/iTs4FefsX9j41AxZl5b4n9dTGfx1lJxnyxnJGB5571uUdYSVAVD5zYxO19GOdr41C3HWUq Umcs3NHzaPQo3KmsqVp63kn7aRTj/Jzb6dbpH2P1CwAA//8DAFBLAwQUAAYACAAAACEApvkTOdwA AAAIAQAADwAAAGRycy9kb3ducmV2LnhtbEyPwU7DMBBE70j9B2srcaNOi6ggjVOlQK+VKEjAzY0X O2q8jmK3CX/PwqVcRhqNdnZesR59K87YxyaQgvksA4FUB9OQVfD2ur25BxGTJqPbQKjgGyOsy8lV oXMTBnrB8z5ZwSUUc63ApdTlUsbaoddxFjokzr5C73Vi21tpej1wuW/lIsuW0uuG+IPTHT46rI/7 k1fw3H3uqjsbZfWe3McxbIat21mlrqfj04qlWoFIOKbLBfwy8H4oedghnMhE0SpgmvSnnD3cLtke FCxAyLKQ/wHKHwAAAP//AwBQSwECLQAUAAYACAAAACEAWiKTo/8AAADlAQAAEwAAAAAAAAAAAAAA AAAAAAAAW0NvbnRlbnRfVHlwZXNdLnhtbFBLAQItABQABgAIAAAAIQCnSs841wAAAJYBAAALAAAA AAAAAAAAAAAAADABAABfcmVscy8ucmVsc1BLAQItABQABgAIAAAAIQA+i/dfPQIAAHkEAAAOAAAA AAAAAAAAAAAAADACAABkcnMvZTJvRG9jLnhtbFBLAQItABQABgAIAAAAIQCm+RM53AAAAAgBAAAP AAAAAAAAAAAAAAAAAJkEAABkcnMvZG93bnJldi54bWxQSwUGAAAAAAQABADzAAAAogUAAAAA " filled="f">
                 <w10:anchorlock/>
               </v:rect>
             </w:pict>
@@ -3013,6 +3031,220 @@
       <w:ins w:id="9028" w:author="Claude" w:date="2026-09-24T00:00:00Z">
         <w:r>
           <w:t xml:space="preserve">Turn-timer alerts (the 10-second warning and time running out) always appear as text in the browser and the app, as well as through the Sigil’s light and sound.</w:t>
+        </w:r>
+      </w:ins>
+    </w:p>
+    <w:p>
+      <w:pPr>
+        <w:pStyle w:val="Heading2"/>
+        <w:rPr>
+          <w:ins w:id="9104" w:author="Claude" w:date="2026-09-24T12:00:00Z"/>
+          <w:rFonts w:eastAsia="Times New Roman"/>
+        </w:rPr>
+      </w:pPr>
+      <w:ins w:id="9105" w:author="Claude" w:date="2026-09-24T12:00:00Z">
+        <w:r>
+          <w:rPr>
+            <w:rFonts w:eastAsia="Times New Roman"/>
+          </w:rPr>
+          <w:t>Accessibility Settings</w:t>
+        </w:r>
+      </w:ins>
+    </w:p>
+    <w:p>
+      <w:pPr>
+        <w:pStyle w:val="NormalWeb"/>
+        <w:rPr>
+          <w:ins w:id="9106" w:author="Claude" w:date="2026-09-24T12:00:00Z"/>
+        </w:rPr>
+      </w:pPr>
+      <w:ins w:id="9107" w:author="Claude" w:date="2026-09-24T12:00:00Z">
+        <w:r>
+          <w:t xml:space="preserve">Each player can choose how their Sigil behaves. Sign in, then open </w:t>
+        </w:r>
+      </w:ins>
+      <w:ins w:id="9108" w:author="Claude" w:date="2026-09-24T12:00:00Z">
+        <w:r>
+          <w:rPr>
+            <w:rStyle w:val="Strong"/>
+          </w:rPr>
+          <w:t xml:space="preserve">My Account</w:t>
+        </w:r>
+      </w:ins>
+      <w:ins w:id="9109" w:author="Claude" w:date="2026-09-24T12:00:00Z">
+        <w:r>
+          <w:t xml:space="preserve"> in the browser and find </w:t>
+        </w:r>
+      </w:ins>
+      <w:ins w:id="9110" w:author="Claude" w:date="2026-09-24T12:00:00Z">
+        <w:r>
+          <w:rPr>
+            <w:rStyle w:val="Strong"/>
+          </w:rPr>
+          <w:t xml:space="preserve">Sigil accessibility</w:t>
+        </w:r>
+      </w:ins>
+      <w:ins w:id="9111" w:author="Claude" w:date="2026-09-24T12:00:00Z">
+        <w:r>
+          <w:t xml:space="preserve">, or tap </w:t>
+        </w:r>
+      </w:ins>
+      <w:ins w:id="9112" w:author="Claude" w:date="2026-09-24T12:00:00Z">
+        <w:r>
+          <w:rPr>
+            <w:rStyle w:val="Strong"/>
+          </w:rPr>
+          <w:t xml:space="preserve">Sigil accessibility</w:t>
+        </w:r>
+      </w:ins>
+      <w:ins w:id="9113" w:author="Claude" w:date="2026-09-24T12:00:00Z">
+        <w:r>
+          <w:t xml:space="preserve"> in the Android app. Your choices are saved with your profile on Atlas and follow you to whichever Sigil you use.</w:t>
+        </w:r>
+      </w:ins>
+    </w:p>
+    <w:p>
+      <w:pPr>
+        <w:numPr>
+          <w:ilvl w:val="0"/>
+          <w:numId w:val="11"/>
+        </w:numPr>
+        <w:spacing w:before="100" w:beforeAutospacing="1" w:after="100" w:afterAutospacing="1" w:line="240" w:lineRule="auto"/>
+        <w:rPr>
+          <w:ins w:id="9116" w:author="Claude" w:date="2026-09-24T12:00:00Z"/>
+          <w:rFonts w:eastAsia="Times New Roman"/>
+        </w:rPr>
+      </w:pPr>
+      <w:ins w:id="9114" w:author="Claude" w:date="2026-09-24T12:00:00Z">
+        <w:r>
+          <w:rPr>
+            <w:rFonts w:eastAsia="Times New Roman"/>
+            <w:b/>
+            <w:bCs/>
+          </w:rPr>
+          <w:t xml:space="preserve">Sigil sound: </w:t>
+        </w:r>
+      </w:ins>
+      <w:ins w:id="9115" w:author="Claude" w:date="2026-09-24T12:00:00Z">
+        <w:r>
+          <w:rPr>
+            <w:rFonts w:eastAsia="Times New Roman"/>
+          </w:rPr>
+          <w:t xml:space="preserve">turn your Sigil’s tones off. Everything a tone means still appears as text in the browser and the app.</w:t>
+        </w:r>
+      </w:ins>
+    </w:p>
+    <w:p>
+      <w:pPr>
+        <w:numPr>
+          <w:ilvl w:val="0"/>
+          <w:numId w:val="11"/>
+        </w:numPr>
+        <w:spacing w:before="100" w:beforeAutospacing="1" w:after="100" w:afterAutospacing="1" w:line="240" w:lineRule="auto"/>
+        <w:rPr>
+          <w:ins w:id="9119" w:author="Claude" w:date="2026-09-24T12:00:00Z"/>
+          <w:rFonts w:eastAsia="Times New Roman"/>
+        </w:rPr>
+      </w:pPr>
+      <w:ins w:id="9117" w:author="Claude" w:date="2026-09-24T12:00:00Z">
+        <w:r>
+          <w:rPr>
+            <w:rFonts w:eastAsia="Times New Roman"/>
+            <w:b/>
+            <w:bCs/>
+          </w:rPr>
+          <w:t xml:space="preserve">Sigil lights: </w:t>
+        </w:r>
+      </w:ins>
+      <w:ins w:id="9118" w:author="Claude" w:date="2026-09-24T12:00:00Z">
+        <w:r>
+          <w:rPr>
+            <w:rFonts w:eastAsia="Times New Roman"/>
+          </w:rPr>
+          <w:t xml:space="preserve">Standard; Reduced motion (steady lights and slow blinks only, with your turn bright and waiting dim); or Monochrome-safe (no two signals differ by colour alone).</w:t>
+        </w:r>
+      </w:ins>
+    </w:p>
+    <w:p>
+      <w:pPr>
+        <w:numPr>
+          <w:ilvl w:val="0"/>
+          <w:numId w:val="11"/>
+        </w:numPr>
+        <w:spacing w:before="100" w:beforeAutospacing="1" w:after="100" w:afterAutospacing="1" w:line="240" w:lineRule="auto"/>
+        <w:rPr>
+          <w:ins w:id="9122" w:author="Claude" w:date="2026-09-24T12:00:00Z"/>
+          <w:rFonts w:eastAsia="Times New Roman"/>
+        </w:rPr>
+      </w:pPr>
+      <w:ins w:id="9120" w:author="Claude" w:date="2026-09-24T12:00:00Z">
+        <w:r>
+          <w:rPr>
+            <w:rFonts w:eastAsia="Times New Roman"/>
+            <w:b/>
+            <w:bCs/>
+          </w:rPr>
+          <w:t xml:space="preserve">Hold times: </w:t>
+        </w:r>
+      </w:ins>
+      <w:ins w:id="9121" w:author="Claude" w:date="2026-09-24T12:00:00Z">
+        <w:r>
+          <w:rPr>
+            <w:rFonts w:eastAsia="Times New Roman"/>
+          </w:rPr>
+          <w:t xml:space="preserve">how long to hold Action to pause (1 to 4 seconds, normally 2) and to claim a win (3 to 10 seconds, normally 5). The win hold is always at least one second longer. Sigils need updated firmware for this; older Sigils keep 2 and 5 seconds.</w:t>
+        </w:r>
+      </w:ins>
+    </w:p>
+    <w:p>
+      <w:pPr>
+        <w:pStyle w:val="NormalWeb"/>
+        <w:rPr>
+          <w:ins w:id="9123" w:author="Claude" w:date="2026-09-24T12:00:00Z"/>
+        </w:rPr>
+      </w:pPr>
+      <w:ins w:id="9124" w:author="Claude" w:date="2026-09-24T12:00:00Z">
+        <w:r>
+          <w:t xml:space="preserve">If two players share a Sigil, it uses the more accommodating choice: it stays quiet if either player turned sound off, uses reduced motion if either chose it, and uses the longer hold times.</w:t>
+        </w:r>
+      </w:ins>
+    </w:p>
+    <w:p>
+      <w:pPr>
+        <w:pStyle w:val="NormalWeb"/>
+        <w:rPr>
+          <w:ins w:id="9125" w:author="Claude" w:date="2026-09-24T12:00:00Z"/>
+        </w:rPr>
+      </w:pPr>
+      <w:ins w:id="9126" w:author="Claude" w:date="2026-09-24T12:00:00Z">
+        <w:r>
+          <w:t xml:space="preserve">When a decision is waiting on you, such as confirming a win or approving a life change, your Sigil plays two short tones (unless its sound is off) and the request appears on screen.</w:t>
+        </w:r>
+      </w:ins>
+    </w:p>
+    <w:p>
+      <w:pPr>
+        <w:pStyle w:val="NormalWeb"/>
+        <w:rPr>
+          <w:ins w:id="9127" w:author="Claude" w:date="2026-09-24T12:00:00Z"/>
+        </w:rPr>
+      </w:pPr>
+      <w:ins w:id="9128" w:author="Claude" w:date="2026-09-24T12:00:00Z">
+        <w:r>
+          <w:t xml:space="preserve">The browser’s own appearance is set separately on each phone or computer, under </w:t>
+        </w:r>
+      </w:ins>
+      <w:ins w:id="9129" w:author="Claude" w:date="2026-09-24T12:00:00Z">
+        <w:r>
+          <w:rPr>
+            <w:rStyle w:val="Strong"/>
+          </w:rPr>
+          <w:t xml:space="preserve">Appearance</w:t>
+        </w:r>
+      </w:ins>
+      <w:ins w:id="9130" w:author="Claude" w:date="2026-09-24T12:00:00Z">
+        <w:r>
+          <w:t xml:space="preserve"> in My Account: themes including High contrast (chosen automatically when your device asks for more contrast), Reduce motion, and browser sound and vibration. The Android app follows the phone’s contrast, text size and screen-reader settings.</w:t>
         </w:r>
       </w:ins>
     </w:p>
@@ -3081,7 +3313,7 @@
           </mc:Choice>
           <mc:Fallback>
             <w:pict>
-              <v:rect w14:anchorId="7355EE8C" id="Rectangle 12" o:spid="_x0000_s1026" style="width:468pt;height:.1pt;visibility:visible;mso-wrap-style:square;mso-left-percent:-10001;mso-top-percent:-10001;mso-position-horizontal:absolute;mso-position-horizontal-relative:char;mso-position-vertical:absolute;mso-position-vertical-relative:line;mso-left-percent:-10001;mso-top-percent:-10001;v-text-anchor:top" o:gfxdata="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" filled="f">
+              <v:rect w14:anchorId="7355EE8C" id="Rectangle 12" o:spid="_x0000_s1026" style="width:468pt;height:.1pt;visibility:visible;mso-wrap-style:square;mso-left-percent:-10001;mso-top-percent:-10001;mso-position-horizontal:absolute;mso-position-horizontal-relative:char;mso-position-vertical:absolute;mso-position-vertical-relative:line;mso-left-percent:-10001;mso-top-percent:-10001;v-text-anchor:top" o:gfxdata="UEsDBBQABgAIAAAAIQBaIpOj/wAAAOUBAAATAAAAW0NvbnRlbnRfVHlwZXNdLnhtbJSRQU7DMBBF 90jcwZotSpx2gRBK0gVpl4BQOYBlTxKLZGx5TGhvj5NCF4gisbRn/n9Pdrk5jIOYMLB1VMEqL0Ag aWcsdRW87nfZHQiOiowaHGEFR2TY1NdX5f7okUVKE1fQx+jvpWTd46g4dx4pTVoXRhXTMXTSK/2m OpTroriV2lFEilmcO6AuG2zV+xDF9pCuTyYBBwbxcFqcWRUo7werVUymciLzg5J9EfKUXHa4t55v kgYI+StiGV0kfAef0uMEa1A8qxAf1ZhEpAksce0ap/O/S2bNkTPXtlZj3gTeLqmz1aVy4z4o4PTf 9ibFXnA618vlk+pPAAAA//8DAFBLAwQUAAYACAAAACEAp0rPONcAAACWAQAACwAAAF9yZWxzLy5y ZWxzpJDBasMwDIbvg72D0X1xmsMYo04vo9Br6R7A2IpjGltGMtn69jM7jGX0tqN+oe/70f7wmRa1 IkukbGDX9aAwO/IxBwPvl+PTCyipNnu7UEYDNxQ4jI8P+zMutrYjmWMR1ShZDMy1lletxc2YrHRU MLfNRJxsbSMHXay72oB66Ptnzb8ZMG6Y6uQN8MkPoC630sx/2Ck6JqGpdo6SpmmK7h5Ve/rIZ1wb xXLAasCzfIeMa9fKgdL3xbt/igPbMkd3ZJvwjdy2AA7Ush+/3nxz/AIAAP//AwBQSwMEFAAGAAgA AAAhAD6L9189AgAAeQQAAA4AAABkcnMvZTJvRG9jLnhtbKxU227bMAx9H7B/EPS+2s6SpjXqFEUv w4DuAnTDnhVZtoXJokYpcbKvHyU7l21vw2JAEEXxkIdHzM3trjdsq9BrsBUvLnLOlJVQa9tW/OuX pzdXnPkgbC0MWFXxvfL8dvX61c3gSjWDDkytkBGI9eXgKt6F4Mos87JTvfAX4JQlZwPYi0AmtlmN YiD03mSzPL/MBsDaIUjlPZ0+jE6+SvhNo2T41DReBWYqTrWFtGJa12nNVjeibFG4TsupDvEPZfRC W8p6hHoQQbAN6r+gei0RPDThQkKfQdNoqRIJolPkf9B56YRTiQx1x7tjn/z/g5Ufty/uM8bSvXsG +d0zC/edsK26Q4ShU6KmdAVn1KlscL48RkTDUyxbDx+gJnHFJkBqwq7BPiISPbZLbd6fmq12gUk6 nReXxXw5W3AmyVvMlqRPzCHKQ7hDH94p6FncVBxJzQQvts8+THcPd2I6C0/amOgQpbFsqPj1gvCj SQrXyYkQvunQpc7GmpLTE964YQ6I7XjssV3fG2RbQY/nLo/focLWn18v8vhLUL/FPL6N33kMkWsP yYy2jNpc8cV8jJ8YHUqNGXodaDyM7it+dbokyqjKo61HqkFoMxmEb+ykU5QmzoEv11DvSSainlSg caVNB/iTs4FefsX9j41AxZl5b4n9dTGfx1lJxnyxnJGB5571uUdYSVAVD5zYxO19GOdr41C3HWUq Umcs3NHzaPQo3KmsqVp63kn7aRTj/Jzb6dbpH2P1CwAA//8DAFBLAwQUAAYACAAAACEApvkTOdwA AAAIAQAADwAAAGRycy9kb3ducmV2LnhtbEyPwU7DMBBE70j9B2srcaNOi6ggjVOlQK+VKEjAzY0X O2q8jmK3CX/PwqVcRhqNdnZesR59K87YxyaQgvksA4FUB9OQVfD2ur25BxGTJqPbQKjgGyOsy8lV oXMTBnrB8z5ZwSUUc63ApdTlUsbaoddxFjokzr5C73Vi21tpej1wuW/lIsuW0uuG+IPTHT46rI/7 k1fw3H3uqjsbZfWe3McxbIat21mlrqfj04qlWoFIOKbLBfwy8H4oedghnMhE0SpgmvSnnD3cLtke FCxAyLKQ/wHKHwAAAP//AwBQSwECLQAUAAYACAAAACEAWiKTo/8AAADlAQAAEwAAAAAAAAAAAAAA AAAAAAAAW0NvbnRlbnRfVHlwZXNdLnhtbFBLAQItABQABgAIAAAAIQCnSs841wAAAJYBAAALAAAA AAAAAAAAAAAAADABAABfcmVscy8ucmVsc1BLAQItABQABgAIAAAAIQA+i/dfPQIAAHkEAAAOAAAA AAAAAAAAAAAAADACAABkcnMvZTJvRG9jLnhtbFBLAQItABQABgAIAAAAIQCm+RM53AAAAAgBAAAP AAAAAAAAAAAAAAAAAJkEAABkcnMvZG93bnJldi54bWxQSwUGAAAAAAQABADzAAAAogUAAAAA " filled="f">
                 <w10:anchorlock/>
               </v:rect>
             </w:pict>
@@ -3224,7 +3456,7 @@
           </mc:Choice>
           <mc:Fallback>
             <w:pict>
-              <v:rect w14:anchorId="3CA28E1E" id="Rectangle 11" o:spid="_x0000_s1026" style="width:468pt;height:.1pt;visibility:visible;mso-wrap-style:square;mso-left-percent:-10001;mso-top-percent:-10001;mso-position-horizontal:absolute;mso-position-horizontal-relative:char;mso-position-vertical:absolute;mso-position-vertical-relative:line;mso-left-percent:-10001;mso-top-percent:-10001;v-text-anchor:top" o:gfxdata="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" filled="f">
+              <v:rect w14:anchorId="3CA28E1E" id="Rectangle 11" o:spid="_x0000_s1026" style="width:468pt;height:.1pt;visibility:visible;mso-wrap-style:square;mso-left-percent:-10001;mso-top-percent:-10001;mso-position-horizontal:absolute;mso-position-horizontal-relative:char;mso-position-vertical:absolute;mso-position-vertical-relative:line;mso-left-percent:-10001;mso-top-percent:-10001;v-text-anchor:top" o:gfxdata="UEsDBBQABgAIAAAAIQBaIpOj/wAAAOUBAAATAAAAW0NvbnRlbnRfVHlwZXNdLnhtbJSRQU7DMBBF 90jcwZotSpx2gRBK0gVpl4BQOYBlTxKLZGx5TGhvj5NCF4gisbRn/n9Pdrk5jIOYMLB1VMEqL0Ag aWcsdRW87nfZHQiOiowaHGEFR2TY1NdX5f7okUVKE1fQx+jvpWTd46g4dx4pTVoXRhXTMXTSK/2m OpTroriV2lFEilmcO6AuG2zV+xDF9pCuTyYBBwbxcFqcWRUo7werVUymciLzg5J9EfKUXHa4t55v kgYI+StiGV0kfAef0uMEa1A8qxAf1ZhEpAksce0ap/O/S2bNkTPXtlZj3gTeLqmz1aVy4z4o4PTf 9ibFXnA618vlk+pPAAAA//8DAFBLAwQUAAYACAAAACEAp0rPONcAAACWAQAACwAAAF9yZWxzLy5y ZWxzpJDBasMwDIbvg72D0X1xmsMYo04vo9Br6R7A2IpjGltGMtn69jM7jGX0tqN+oe/70f7wmRa1 IkukbGDX9aAwO/IxBwPvl+PTCyipNnu7UEYDNxQ4jI8P+zMutrYjmWMR1ShZDMy1lletxc2YrHRU MLfNRJxsbSMHXay72oB66Ptnzb8ZMG6Y6uQN8MkPoC630sx/2Ck6JqGpdo6SpmmK7h5Ve/rIZ1wb xXLAasCzfIeMa9fKgdL3xbt/igPbMkd3ZJvwjdy2AA7Ush+/3nxz/AIAAP//AwBQSwMEFAAGAAgA AAAhAD6L9189AgAAeQQAAA4AAABkcnMvZTJvRG9jLnhtbKxU227bMAx9H7B/EPS+2s6SpjXqFEUv w4DuAnTDnhVZtoXJokYpcbKvHyU7l21vw2JAEEXxkIdHzM3trjdsq9BrsBUvLnLOlJVQa9tW/OuX pzdXnPkgbC0MWFXxvfL8dvX61c3gSjWDDkytkBGI9eXgKt6F4Mos87JTvfAX4JQlZwPYi0AmtlmN YiD03mSzPL/MBsDaIUjlPZ0+jE6+SvhNo2T41DReBWYqTrWFtGJa12nNVjeibFG4TsupDvEPZfRC W8p6hHoQQbAN6r+gei0RPDThQkKfQdNoqRIJolPkf9B56YRTiQx1x7tjn/z/g5Ufty/uM8bSvXsG +d0zC/edsK26Q4ShU6KmdAVn1KlscL48RkTDUyxbDx+gJnHFJkBqwq7BPiISPbZLbd6fmq12gUk6 nReXxXw5W3AmyVvMlqRPzCHKQ7hDH94p6FncVBxJzQQvts8+THcPd2I6C0/amOgQpbFsqPj1gvCj SQrXyYkQvunQpc7GmpLTE964YQ6I7XjssV3fG2RbQY/nLo/focLWn18v8vhLUL/FPL6N33kMkWsP yYy2jNpc8cV8jJ8YHUqNGXodaDyM7it+dbokyqjKo61HqkFoMxmEb+ykU5QmzoEv11DvSSainlSg caVNB/iTs4FefsX9j41AxZl5b4n9dTGfx1lJxnyxnJGB5571uUdYSVAVD5zYxO19GOdr41C3HWUq Umcs3NHzaPQo3KmsqVp63kn7aRTj/Jzb6dbpH2P1CwAA//8DAFBLAwQUAAYACAAAACEApvkTOdwA AAAIAQAADwAAAGRycy9kb3ducmV2LnhtbEyPwU7DMBBE70j9B2srcaNOi6ggjVOlQK+VKEjAzY0X O2q8jmK3CX/PwqVcRhqNdnZesR59K87YxyaQgvksA4FUB9OQVfD2ur25BxGTJqPbQKjgGyOsy8lV oXMTBnrB8z5ZwSUUc63ApdTlUsbaoddxFjokzr5C73Vi21tpej1wuW/lIsuW0uuG+IPTHT46rI/7 k1fw3H3uqjsbZfWe3McxbIat21mlrqfj04qlWoFIOKbLBfwy8H4oedghnMhE0SpgmvSnnD3cLtke FCxAyLKQ/wHKHwAAAP//AwBQSwECLQAUAAYACAAAACEAWiKTo/8AAADlAQAAEwAAAAAAAAAAAAAA AAAAAAAAW0NvbnRlbnRfVHlwZXNdLnhtbFBLAQItABQABgAIAAAAIQCnSs841wAAAJYBAAALAAAA AAAAAAAAAAAAADABAABfcmVscy8ucmVsc1BLAQItABQABgAIAAAAIQA+i/dfPQIAAHkEAAAOAAAA AAAAAAAAAAAAADACAABkcnMvZTJvRG9jLnhtbFBLAQItABQABgAIAAAAIQCm+RM53AAAAAgBAAAP AAAAAAAAAAAAAAAAAJkEAABkcnMvZG93bnJldi54bWxQSwUGAAAAAAQABADzAAAAogUAAAAA " filled="f">
                 <w10:anchorlock/>
               </v:rect>
             </w:pict>
@@ -3361,7 +3593,7 @@
           </mc:Choice>
           <mc:Fallback>
             <w:pict>
-              <v:rect w14:anchorId="1CE405E1" id="Rectangle 10" o:spid="_x0000_s1026" style="width:468pt;height:.1pt;visibility:visible;mso-wrap-style:square;mso-left-percent:-10001;mso-top-percent:-10001;mso-position-horizontal:absolute;mso-position-horizontal-relative:char;mso-position-vertical:absolute;mso-position-vertical-relative:line;mso-left-percent:-10001;mso-top-percent:-10001;v-text-anchor:top" o:gfxdata="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" filled="f">
+              <v:rect w14:anchorId="1CE405E1" id="Rectangle 10" o:spid="_x0000_s1026" style="width:468pt;height:.1pt;visibility:visible;mso-wrap-style:square;mso-left-percent:-10001;mso-top-percent:-10001;mso-position-horizontal:absolute;mso-position-horizontal-relative:char;mso-position-vertical:absolute;mso-position-vertical-relative:line;mso-left-percent:-10001;mso-top-percent:-10001;v-text-anchor:top" o:gfxdata="UEsDBBQABgAIAAAAIQBaIpOj/wAAAOUBAAATAAAAW0NvbnRlbnRfVHlwZXNdLnhtbJSRQU7DMBBF 90jcwZotSpx2gRBK0gVpl4BQOYBlTxKLZGx5TGhvj5NCF4gisbRn/n9Pdrk5jIOYMLB1VMEqL0Ag aWcsdRW87nfZHQiOiowaHGEFR2TY1NdX5f7okUVKE1fQx+jvpWTd46g4dx4pTVoXRhXTMXTSK/2m OpTroriV2lFEilmcO6AuG2zV+xDF9pCuTyYBBwbxcFqcWRUo7werVUymciLzg5J9EfKUXHa4t55v kgYI+StiGV0kfAef0uMEa1A8qxAf1ZhEpAksce0ap/O/S2bNkTPXtlZj3gTeLqmz1aVy4z4o4PTf 9ibFXnA618vlk+pPAAAA//8DAFBLAwQUAAYACAAAACEAp0rPONcAAACWAQAACwAAAF9yZWxzLy5y ZWxzpJDBasMwDIbvg72D0X1xmsMYo04vo9Br6R7A2IpjGltGMtn69jM7jGX0tqN+oe/70f7wmRa1 IkukbGDX9aAwO/IxBwPvl+PTCyipNnu7UEYDNxQ4jI8P+zMutrYjmWMR1ShZDMy1lletxc2YrHRU MLfNRJxsbSMHXay72oB66Ptnzb8ZMG6Y6uQN8MkPoC630sx/2Ck6JqGpdo6SpmmK7h5Ve/rIZ1wb xXLAasCzfIeMa9fKgdL3xbt/igPbMkd3ZJvwjdy2AA7Ush+/3nxz/AIAAP//AwBQSwMEFAAGAAgA AAAhAD6L9189AgAAeQQAAA4AAABkcnMvZTJvRG9jLnhtbKxU227bMAx9H7B/EPS+2s6SpjXqFEUv w4DuAnTDnhVZtoXJokYpcbKvHyU7l21vw2JAEEXxkIdHzM3trjdsq9BrsBUvLnLOlJVQa9tW/OuX pzdXnPkgbC0MWFXxvfL8dvX61c3gSjWDDkytkBGI9eXgKt6F4Mos87JTvfAX4JQlZwPYi0AmtlmN YiD03mSzPL/MBsDaIUjlPZ0+jE6+SvhNo2T41DReBWYqTrWFtGJa12nNVjeibFG4TsupDvEPZfRC W8p6hHoQQbAN6r+gei0RPDThQkKfQdNoqRIJolPkf9B56YRTiQx1x7tjn/z/g5Ufty/uM8bSvXsG +d0zC/edsK26Q4ShU6KmdAVn1KlscL48RkTDUyxbDx+gJnHFJkBqwq7BPiISPbZLbd6fmq12gUk6 nReXxXw5W3AmyVvMlqRPzCHKQ7hDH94p6FncVBxJzQQvts8+THcPd2I6C0/amOgQpbFsqPj1gvCj SQrXyYkQvunQpc7GmpLTE964YQ6I7XjssV3fG2RbQY/nLo/focLWn18v8vhLUL/FPL6N33kMkWsP yYy2jNpc8cV8jJ8YHUqNGXodaDyM7it+dbokyqjKo61HqkFoMxmEb+ykU5QmzoEv11DvSSainlSg caVNB/iTs4FefsX9j41AxZl5b4n9dTGfx1lJxnyxnJGB5571uUdYSVAVD5zYxO19GOdr41C3HWUq Umcs3NHzaPQo3KmsqVp63kn7aRTj/Jzb6dbpH2P1CwAA//8DAFBLAwQUAAYACAAAACEApvkTOdwA AAAIAQAADwAAAGRycy9kb3ducmV2LnhtbEyPwU7DMBBE70j9B2srcaNOi6ggjVOlQK+VKEjAzY0X O2q8jmK3CX/PwqVcRhqNdnZesR59K87YxyaQgvksA4FUB9OQVfD2ur25BxGTJqPbQKjgGyOsy8lV oXMTBnrB8z5ZwSUUc63ApdTlUsbaoddxFjokzr5C73Vi21tpej1wuW/lIsuW0uuG+IPTHT46rI/7 k1fw3H3uqjsbZfWe3McxbIat21mlrqfj04qlWoFIOKbLBfwy8H4oedghnMhE0SpgmvSnnD3cLtke FCxAyLKQ/wHKHwAAAP//AwBQSwECLQAUAAYACAAAACEAWiKTo/8AAADlAQAAEwAAAAAAAAAAAAAA AAAAAAAAW0NvbnRlbnRfVHlwZXNdLnhtbFBLAQItABQABgAIAAAAIQCnSs841wAAAJYBAAALAAAA AAAAAAAAAAAAADABAABfcmVscy8ucmVsc1BLAQItABQABgAIAAAAIQA+i/dfPQIAAHkEAAAOAAAA AAAAAAAAAAAAADACAABkcnMvZTJvRG9jLnhtbFBLAQItABQABgAIAAAAIQCm+RM53AAAAAgBAAAP AAAAAAAAAAAAAAAAAJkEAABkcnMvZG93bnJldi54bWxQSwUGAAAAAAQABADzAAAAogUAAAAA " filled="f">
                 <w10:anchorlock/>
               </v:rect>
             </w:pict>
@@ -3820,7 +4052,7 @@
           </mc:Choice>
           <mc:Fallback>
             <w:pict>
-              <v:rect w14:anchorId="66F4820D" id="Rectangle 9" o:spid="_x0000_s1026" style="width:468pt;height:.1pt;visibility:visible;mso-wrap-style:square;mso-left-percent:-10001;mso-top-percent:-10001;mso-position-horizontal:absolute;mso-position-horizontal-relative:char;mso-position-vertical:absolute;mso-position-vertical-relative:line;mso-left-percent:-10001;mso-top-percent:-10001;v-text-anchor:top" o:gfxdata="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" filled="f">
+              <v:rect w14:anchorId="66F4820D" id="Rectangle 9" o:spid="_x0000_s1026" style="width:468pt;height:.1pt;visibility:visible;mso-wrap-style:square;mso-left-percent:-10001;mso-top-percent:-10001;mso-position-horizontal:absolute;mso-position-horizontal-relative:char;mso-position-vertical:absolute;mso-position-vertical-relative:line;mso-left-percent:-10001;mso-top-percent:-10001;v-text-anchor:top" o:gfxdata="UEsDBBQABgAIAAAAIQBaIpOj/wAAAOUBAAATAAAAW0NvbnRlbnRfVHlwZXNdLnhtbJSRQU7DMBBF 90jcwZotSpx2gRBK0gVpl4BQOYBlTxKLZGx5TGhvj5NCF4gisbRn/n9Pdrk5jIOYMLB1VMEqL0Ag aWcsdRW87nfZHQiOiowaHGEFR2TY1NdX5f7okUVKE1fQx+jvpWTd46g4dx4pTVoXRhXTMXTSK/2m OpTroriV2lFEilmcO6AuG2zV+xDF9pCuTyYBBwbxcFqcWRUo7werVUymciLzg5J9EfKUXHa4t55v kgYI+StiGV0kfAef0uMEa1A8qxAf1ZhEpAksce0ap/O/S2bNkTPXtlZj3gTeLqmz1aVy4z4o4PTf 9ibFXnA618vlk+pPAAAA//8DAFBLAwQUAAYACAAAACEAp0rPONcAAACWAQAACwAAAF9yZWxzLy5y ZWxzpJDBasMwDIbvg72D0X1xmsMYo04vo9Br6R7A2IpjGltGMtn69jM7jGX0tqN+oe/70f7wmRa1 IkukbGDX9aAwO/IxBwPvl+PTCyipNnu7UEYDNxQ4jI8P+zMutrYjmWMR1ShZDMy1lletxc2YrHRU MLfNRJxsbSMHXay72oB66Ptnzb8ZMG6Y6uQN8MkPoC630sx/2Ck6JqGpdo6SpmmK7h5Ve/rIZ1wb xXLAasCzfIeMa9fKgdL3xbt/igPbMkd3ZJvwjdy2AA7Ush+/3nxz/AIAAP//AwBQSwMEFAAGAAgA AAAhAD6L9189AgAAeQQAAA4AAABkcnMvZTJvRG9jLnhtbKxU227bMAx9H7B/EPS+2s6SpjXqFEUv w4DuAnTDnhVZtoXJokYpcbKvHyU7l21vw2JAEEXxkIdHzM3trjdsq9BrsBUvLnLOlJVQa9tW/OuX pzdXnPkgbC0MWFXxvfL8dvX61c3gSjWDDkytkBGI9eXgKt6F4Mos87JTvfAX4JQlZwPYi0AmtlmN YiD03mSzPL/MBsDaIUjlPZ0+jE6+SvhNo2T41DReBWYqTrWFtGJa12nNVjeibFG4TsupDvEPZfRC W8p6hHoQQbAN6r+gei0RPDThQkKfQdNoqRIJolPkf9B56YRTiQx1x7tjn/z/g5Ufty/uM8bSvXsG +d0zC/edsK26Q4ShU6KmdAVn1KlscL48RkTDUyxbDx+gJnHFJkBqwq7BPiISPbZLbd6fmq12gUk6 nReXxXw5W3AmyVvMlqRPzCHKQ7hDH94p6FncVBxJzQQvts8+THcPd2I6C0/amOgQpbFsqPj1gvCj SQrXyYkQvunQpc7GmpLTE964YQ6I7XjssV3fG2RbQY/nLo/focLWn18v8vhLUL/FPL6N33kMkWsP yYy2jNpc8cV8jJ8YHUqNGXodaDyM7it+dbokyqjKo61HqkFoMxmEb+ykU5QmzoEv11DvSSainlSg caVNB/iTs4FefsX9j41AxZl5b4n9dTGfx1lJxnyxnJGB5571uUdYSVAVD5zYxO19GOdr41C3HWUq Umcs3NHzaPQo3KmsqVp63kn7aRTj/Jzb6dbpH2P1CwAA//8DAFBLAwQUAAYACAAAACEApvkTOdwA AAAIAQAADwAAAGRycy9kb3ducmV2LnhtbEyPwU7DMBBE70j9B2srcaNOi6ggjVOlQK+VKEjAzY0X O2q8jmK3CX/PwqVcRhqNdnZesR59K87YxyaQgvksA4FUB9OQVfD2ur25BxGTJqPbQKjgGyOsy8lV oXMTBnrB8z5ZwSUUc63ApdTlUsbaoddxFjokzr5C73Vi21tpej1wuW/lIsuW0uuG+IPTHT46rI/7 k1fw3H3uqjsbZfWe3McxbIat21mlrqfj04qlWoFIOKbLBfwy8H4oedghnMhE0SpgmvSnnD3cLtke FCxAyLKQ/wHKHwAAAP//AwBQSwECLQAUAAYACAAAACEAWiKTo/8AAADlAQAAEwAAAAAAAAAAAAAA AAAAAAAAW0NvbnRlbnRfVHlwZXNdLnhtbFBLAQItABQABgAIAAAAIQCnSs841wAAAJYBAAALAAAA AAAAAAAAAAAAADABAABfcmVscy8ucmVsc1BLAQItABQABgAIAAAAIQA+i/dfPQIAAHkEAAAOAAAA AAAAAAAAAAAAADACAABkcnMvZTJvRG9jLnhtbFBLAQItABQABgAIAAAAIQCm+RM53AAAAAgBAAAP AAAAAAAAAAAAAAAAAJkEAABkcnMvZG93bnJldi54bWxQSwUGAAAAAAQABADzAAAAogUAAAAA " filled="f">
                 <w10:anchorlock/>
               </v:rect>
             </w:pict>
@@ -4045,7 +4277,7 @@
           </mc:Choice>
           <mc:Fallback>
             <w:pict>
-              <v:rect w14:anchorId="31DFE129" id="Rectangle 8" o:spid="_x0000_s1026" style="width:468pt;height:.1pt;visibility:visible;mso-wrap-style:square;mso-left-percent:-10001;mso-top-percent:-10001;mso-position-horizontal:absolute;mso-position-horizontal-relative:char;mso-position-vertical:absolute;mso-position-vertical-relative:line;mso-left-percent:-10001;mso-top-percent:-10001;v-text-anchor:top" o:gfxdata="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" filled="f">
+              <v:rect w14:anchorId="31DFE129" id="Rectangle 8" o:spid="_x0000_s1026" style="width:468pt;height:.1pt;visibility:visible;mso-wrap-style:square;mso-left-percent:-10001;mso-top-percent:-10001;mso-position-horizontal:absolute;mso-position-horizontal-relative:char;mso-position-vertical:absolute;mso-position-vertical-relative:line;mso-left-percent:-10001;mso-top-percent:-10001;v-text-anchor:top" o:gfxdata="UEsDBBQABgAIAAAAIQBaIpOj/wAAAOUBAAATAAAAW0NvbnRlbnRfVHlwZXNdLnhtbJSRQU7DMBBF 90jcwZotSpx2gRBK0gVpl4BQOYBlTxKLZGx5TGhvj5NCF4gisbRn/n9Pdrk5jIOYMLB1VMEqL0Ag aWcsdRW87nfZHQiOiowaHGEFR2TY1NdX5f7okUVKE1fQx+jvpWTd46g4dx4pTVoXRhXTMXTSK/2m OpTroriV2lFEilmcO6AuG2zV+xDF9pCuTyYBBwbxcFqcWRUo7werVUymciLzg5J9EfKUXHa4t55v kgYI+StiGV0kfAef0uMEa1A8qxAf1ZhEpAksce0ap/O/S2bNkTPXtlZj3gTeLqmz1aVy4z4o4PTf 9ibFXnA618vlk+pPAAAA//8DAFBLAwQUAAYACAAAACEAp0rPONcAAACWAQAACwAAAF9yZWxzLy5y ZWxzpJDBasMwDIbvg72D0X1xmsMYo04vo9Br6R7A2IpjGltGMtn69jM7jGX0tqN+oe/70f7wmRa1 IkukbGDX9aAwO/IxBwPvl+PTCyipNnu7UEYDNxQ4jI8P+zMutrYjmWMR1ShZDMy1lletxc2YrHRU MLfNRJxsbSMHXay72oB66Ptnzb8ZMG6Y6uQN8MkPoC630sx/2Ck6JqGpdo6SpmmK7h5Ve/rIZ1wb xXLAasCzfIeMa9fKgdL3xbt/igPbMkd3ZJvwjdy2AA7Ush+/3nxz/AIAAP//AwBQSwMEFAAGAAgA AAAhAD6L9189AgAAeQQAAA4AAABkcnMvZTJvRG9jLnhtbKxU227bMAx9H7B/EPS+2s6SpjXqFEUv w4DuAnTDnhVZtoXJokYpcbKvHyU7l21vw2JAEEXxkIdHzM3trjdsq9BrsBUvLnLOlJVQa9tW/OuX pzdXnPkgbC0MWFXxvfL8dvX61c3gSjWDDkytkBGI9eXgKt6F4Mos87JTvfAX4JQlZwPYi0AmtlmN YiD03mSzPL/MBsDaIUjlPZ0+jE6+SvhNo2T41DReBWYqTrWFtGJa12nNVjeibFG4TsupDvEPZfRC W8p6hHoQQbAN6r+gei0RPDThQkKfQdNoqRIJolPkf9B56YRTiQx1x7tjn/z/g5Ufty/uM8bSvXsG +d0zC/edsK26Q4ShU6KmdAVn1KlscL48RkTDUyxbDx+gJnHFJkBqwq7BPiISPbZLbd6fmq12gUk6 nReXxXw5W3AmyVvMlqRPzCHKQ7hDH94p6FncVBxJzQQvts8+THcPd2I6C0/amOgQpbFsqPj1gvCj SQrXyYkQvunQpc7GmpLTE964YQ6I7XjssV3fG2RbQY/nLo/focLWn18v8vhLUL/FPL6N33kMkWsP yYy2jNpc8cV8jJ8YHUqNGXodaDyM7it+dbokyqjKo61HqkFoMxmEb+ykU5QmzoEv11DvSSainlSg caVNB/iTs4FefsX9j41AxZl5b4n9dTGfx1lJxnyxnJGB5571uUdYSVAVD5zYxO19GOdr41C3HWUq Umcs3NHzaPQo3KmsqVp63kn7aRTj/Jzb6dbpH2P1CwAA//8DAFBLAwQUAAYACAAAACEApvkTOdwA AAAIAQAADwAAAGRycy9kb3ducmV2LnhtbEyPwU7DMBBE70j9B2srcaNOi6ggjVOlQK+VKEjAzY0X O2q8jmK3CX/PwqVcRhqNdnZesR59K87YxyaQgvksA4FUB9OQVfD2ur25BxGTJqPbQKjgGyOsy8lV oXMTBnrB8z5ZwSUUc63ApdTlUsbaoddxFjokzr5C73Vi21tpej1wuW/lIsuW0uuG+IPTHT46rI/7 k1fw3H3uqjsbZfWe3McxbIat21mlrqfj04qlWoFIOKbLBfwy8H4oedghnMhE0SpgmvSnnD3cLtke FCxAyLKQ/wHKHwAAAP//AwBQSwECLQAUAAYACAAAACEAWiKTo/8AAADlAQAAEwAAAAAAAAAAAAAA AAAAAAAAW0NvbnRlbnRfVHlwZXNdLnhtbFBLAQItABQABgAIAAAAIQCnSs841wAAAJYBAAALAAAA AAAAAAAAAAAAADABAABfcmVscy8ucmVsc1BLAQItABQABgAIAAAAIQA+i/dfPQIAAHkEAAAOAAAA AAAAAAAAAAAAADACAABkcnMvZTJvRG9jLnhtbFBLAQItABQABgAIAAAAIQCm+RM53AAAAAgBAAAP AAAAAAAAAAAAAAAAAJkEAABkcnMvZG93bnJldi54bWxQSwUGAAAAAAQABADzAAAAogUAAAAA " filled="f">
                 <w10:anchorlock/>
               </v:rect>
             </w:pict>
@@ -4236,7 +4468,7 @@
           </mc:Choice>
           <mc:Fallback>
             <w:pict>
-              <v:rect w14:anchorId="319CB277" id="Rectangle 7" o:spid="_x0000_s1026" style="width:468pt;height:.1pt;visibility:visible;mso-wrap-style:square;mso-left-percent:-10001;mso-top-percent:-10001;mso-position-horizontal:absolute;mso-position-horizontal-relative:char;mso-position-vertical:absolute;mso-position-vertical-relative:line;mso-left-percent:-10001;mso-top-percent:-10001;v-text-anchor:top" o:gfxdata="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" filled="f">
+              <v:rect w14:anchorId="319CB277" id="Rectangle 7" o:spid="_x0000_s1026" style="width:468pt;height:.1pt;visibility:visible;mso-wrap-style:square;mso-left-percent:-10001;mso-top-percent:-10001;mso-position-horizontal:absolute;mso-position-horizontal-relative:char;mso-position-vertical:absolute;mso-position-vertical-relative:line;mso-left-percent:-10001;mso-top-percent:-10001;v-text-anchor:top" o:gfxdata="UEsDBBQABgAIAAAAIQBaIpOj/wAAAOUBAAATAAAAW0NvbnRlbnRfVHlwZXNdLnhtbJSRQU7DMBBF 90jcwZotSpx2gRBK0gVpl4BQOYBlTxKLZGx5TGhvj5NCF4gisbRn/n9Pdrk5jIOYMLB1VMEqL0Ag aWcsdRW87nfZHQiOiowaHGEFR2TY1NdX5f7okUVKE1fQx+jvpWTd46g4dx4pTVoXRhXTMXTSK/2m OpTroriV2lFEilmcO6AuG2zV+xDF9pCuTyYBBwbxcFqcWRUo7werVUymciLzg5J9EfKUXHa4t55v kgYI+StiGV0kfAef0uMEa1A8qxAf1ZhEpAksce0ap/O/S2bNkTPXtlZj3gTeLqmz1aVy4z4o4PTf 9ibFXnA618vlk+pPAAAA//8DAFBLAwQUAAYACAAAACEAp0rPONcAAACWAQAACwAAAF9yZWxzLy5y ZWxzpJDBasMwDIbvg72D0X1xmsMYo04vo9Br6R7A2IpjGltGMtn69jM7jGX0tqN+oe/70f7wmRa1 IkukbGDX9aAwO/IxBwPvl+PTCyipNnu7UEYDNxQ4jI8P+zMutrYjmWMR1ShZDMy1lletxc2YrHRU MLfNRJxsbSMHXay72oB66Ptnzb8ZMG6Y6uQN8MkPoC630sx/2Ck6JqGpdo6SpmmK7h5Ve/rIZ1wb xXLAasCzfIeMa9fKgdL3xbt/igPbMkd3ZJvwjdy2AA7Ush+/3nxz/AIAAP//AwBQSwMEFAAGAAgA AAAhAD6L9189AgAAeQQAAA4AAABkcnMvZTJvRG9jLnhtbKxU227bMAx9H7B/EPS+2s6SpjXqFEUv w4DuAnTDnhVZtoXJokYpcbKvHyU7l21vw2JAEEXxkIdHzM3trjdsq9BrsBUvLnLOlJVQa9tW/OuX pzdXnPkgbC0MWFXxvfL8dvX61c3gSjWDDkytkBGI9eXgKt6F4Mos87JTvfAX4JQlZwPYi0AmtlmN YiD03mSzPL/MBsDaIUjlPZ0+jE6+SvhNo2T41DReBWYqTrWFtGJa12nNVjeibFG4TsupDvEPZfRC W8p6hHoQQbAN6r+gei0RPDThQkKfQdNoqRIJolPkf9B56YRTiQx1x7tjn/z/g5Ufty/uM8bSvXsG +d0zC/edsK26Q4ShU6KmdAVn1KlscL48RkTDUyxbDx+gJnHFJkBqwq7BPiISPbZLbd6fmq12gUk6 nReXxXw5W3AmyVvMlqRPzCHKQ7hDH94p6FncVBxJzQQvts8+THcPd2I6C0/amOgQpbFsqPj1gvCj SQrXyYkQvunQpc7GmpLTE964YQ6I7XjssV3fG2RbQY/nLo/focLWn18v8vhLUL/FPL6N33kMkWsP yYy2jNpc8cV8jJ8YHUqNGXodaDyM7it+dbokyqjKo61HqkFoMxmEb+ykU5QmzoEv11DvSSainlSg caVNB/iTs4FefsX9j41AxZl5b4n9dTGfx1lJxnyxnJGB5571uUdYSVAVD5zYxO19GOdr41C3HWUq Umcs3NHzaPQo3KmsqVp63kn7aRTj/Jzb6dbpH2P1CwAA//8DAFBLAwQUAAYACAAAACEApvkTOdwA AAAIAQAADwAAAGRycy9kb3ducmV2LnhtbEyPwU7DMBBE70j9B2srcaNOi6ggjVOlQK+VKEjAzY0X O2q8jmK3CX/PwqVcRhqNdnZesR59K87YxyaQgvksA4FUB9OQVfD2ur25BxGTJqPbQKjgGyOsy8lV oXMTBnrB8z5ZwSUUc63ApdTlUsbaoddxFjokzr5C73Vi21tpej1wuW/lIsuW0uuG+IPTHT46rI/7 k1fw3H3uqjsbZfWe3McxbIat21mlrqfj04qlWoFIOKbLBfwy8H4oedghnMhE0SpgmvSnnD3cLtke FCxAyLKQ/wHKHwAAAP//AwBQSwECLQAUAAYACAAAACEAWiKTo/8AAADlAQAAEwAAAAAAAAAAAAAA AAAAAAAAW0NvbnRlbnRfVHlwZXNdLnhtbFBLAQItABQABgAIAAAAIQCnSs841wAAAJYBAAALAAAA AAAAAAAAAAAAADABAABfcmVscy8ucmVsc1BLAQItABQABgAIAAAAIQA+i/dfPQIAAHkEAAAOAAAA AAAAAAAAAAAAADACAABkcnMvZTJvRG9jLnhtbFBLAQItABQABgAIAAAAIQCm+RM53AAAAAgBAAAP AAAAAAAAAAAAAAAAAJkEAABkcnMvZG93bnJldi54bWxQSwUGAAAAAAQABADzAAAAogUAAAAA " filled="f">
                 <w10:anchorlock/>
               </v:rect>
             </w:pict>
@@ -4355,7 +4587,7 @@
           </mc:Choice>
           <mc:Fallback>
             <w:pict>
-              <v:rect w14:anchorId="360C575B" id="Rectangle 6" o:spid="_x0000_s1026" style="width:468pt;height:.1pt;visibility:visible;mso-wrap-style:square;mso-left-percent:-10001;mso-top-percent:-10001;mso-position-horizontal:absolute;mso-position-horizontal-relative:char;mso-position-vertical:absolute;mso-position-vertical-relative:line;mso-left-percent:-10001;mso-top-percent:-10001;v-text-anchor:top" o:gfxdata="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" filled="f">
+              <v:rect w14:anchorId="360C575B" id="Rectangle 6" o:spid="_x0000_s1026" style="width:468pt;height:.1pt;visibility:visible;mso-wrap-style:square;mso-left-percent:-10001;mso-top-percent:-10001;mso-position-horizontal:absolute;mso-position-horizontal-relative:char;mso-position-vertical:absolute;mso-position-vertical-relative:line;mso-left-percent:-10001;mso-top-percent:-10001;v-text-anchor:top" o:gfxdata="UEsDBBQABgAIAAAAIQBaIpOj/wAAAOUBAAATAAAAW0NvbnRlbnRfVHlwZXNdLnhtbJSRQU7DMBBF 90jcwZotSpx2gRBK0gVpl4BQOYBlTxKLZGx5TGhvj5NCF4gisbRn/n9Pdrk5jIOYMLB1VMEqL0Ag aWcsdRW87nfZHQiOiowaHGEFR2TY1NdX5f7okUVKE1fQx+jvpWTd46g4dx4pTVoXRhXTMXTSK/2m OpTroriV2lFEilmcO6AuG2zV+xDF9pCuTyYBBwbxcFqcWRUo7werVUymciLzg5J9EfKUXHa4t55v kgYI+StiGV0kfAef0uMEa1A8qxAf1ZhEpAksce0ap/O/S2bNkTPXtlZj3gTeLqmz1aVy4z4o4PTf 9ibFXnA618vlk+pPAAAA//8DAFBLAwQUAAYACAAAACEAp0rPONcAAACWAQAACwAAAF9yZWxzLy5y ZWxzpJDBasMwDIbvg72D0X1xmsMYo04vo9Br6R7A2IpjGltGMtn69jM7jGX0tqN+oe/70f7wmRa1 IkukbGDX9aAwO/IxBwPvl+PTCyipNnu7UEYDNxQ4jI8P+zMutrYjmWMR1ShZDMy1lletxc2YrHRU MLfNRJxsbSMHXay72oB66Ptnzb8ZMG6Y6uQN8MkPoC630sx/2Ck6JqGpdo6SpmmK7h5Ve/rIZ1wb xXLAasCzfIeMa9fKgdL3xbt/igPbMkd3ZJvwjdy2AA7Ush+/3nxz/AIAAP//AwBQSwMEFAAGAAgA AAAhAD6L9189AgAAeQQAAA4AAABkcnMvZTJvRG9jLnhtbKxU227bMAx9H7B/EPS+2s6SpjXqFEUv w4DuAnTDnhVZtoXJokYpcbKvHyU7l21vw2JAEEXxkIdHzM3trjdsq9BrsBUvLnLOlJVQa9tW/OuX pzdXnPkgbC0MWFXxvfL8dvX61c3gSjWDDkytkBGI9eXgKt6F4Mos87JTvfAX4JQlZwPYi0AmtlmN YiD03mSzPL/MBsDaIUjlPZ0+jE6+SvhNo2T41DReBWYqTrWFtGJa12nNVjeibFG4TsupDvEPZfRC W8p6hHoQQbAN6r+gei0RPDThQkKfQdNoqRIJolPkf9B56YRTiQx1x7tjn/z/g5Ufty/uM8bSvXsG +d0zC/edsK26Q4ShU6KmdAVn1KlscL48RkTDUyxbDx+gJnHFJkBqwq7BPiISPbZLbd6fmq12gUk6 nReXxXw5W3AmyVvMlqRPzCHKQ7hDH94p6FncVBxJzQQvts8+THcPd2I6C0/amOgQpbFsqPj1gvCj SQrXyYkQvunQpc7GmpLTE964YQ6I7XjssV3fG2RbQY/nLo/focLWn18v8vhLUL/FPL6N33kMkWsP yYy2jNpc8cV8jJ8YHUqNGXodaDyM7it+dbokyqjKo61HqkFoMxmEb+ykU5QmzoEv11DvSSainlSg caVNB/iTs4FefsX9j41AxZl5b4n9dTGfx1lJxnyxnJGB5571uUdYSVAVD5zYxO19GOdr41C3HWUq Umcs3NHzaPQo3KmsqVp63kn7aRTj/Jzb6dbpH2P1CwAA//8DAFBLAwQUAAYACAAAACEApvkTOdwA AAAIAQAADwAAAGRycy9kb3ducmV2LnhtbEyPwU7DMBBE70j9B2srcaNOi6ggjVOlQK+VKEjAzY0X O2q8jmK3CX/PwqVcRhqNdnZesR59K87YxyaQgvksA4FUB9OQVfD2ur25BxGTJqPbQKjgGyOsy8lV oXMTBnrB8z5ZwSUUc63ApdTlUsbaoddxFjokzr5C73Vi21tpej1wuW/lIsuW0uuG+IPTHT46rI/7 k1fw3H3uqjsbZfWe3McxbIat21mlrqfj04qlWoFIOKbLBfwy8H4oedghnMhE0SpgmvSnnD3cLtke FCxAyLKQ/wHKHwAAAP//AwBQSwECLQAUAAYACAAAACEAWiKTo/8AAADlAQAAEwAAAAAAAAAAAAAA AAAAAAAAW0NvbnRlbnRfVHlwZXNdLnhtbFBLAQItABQABgAIAAAAIQCnSs841wAAAJYBAAALAAAA AAAAAAAAAAAAADABAABfcmVscy8ucmVsc1BLAQItABQABgAIAAAAIQA+i/dfPQIAAHkEAAAOAAAA AAAAAAAAAAAAADACAABkcnMvZTJvRG9jLnhtbFBLAQItABQABgAIAAAAIQCm+RM53AAAAAgBAAAP AAAAAAAAAAAAAAAAAJkEAABkcnMvZG93bnJldi54bWxQSwUGAAAAAAQABADzAAAAogUAAAAA " filled="f">
                 <w10:anchorlock/>
               </v:rect>
             </w:pict>
@@ -4561,7 +4793,7 @@
           </mc:Choice>
           <mc:Fallback>
             <w:pict>
-              <v:rect w14:anchorId="3CCF7B05" id="Rectangle 5" o:spid="_x0000_s1026" style="width:468pt;height:.1pt;visibility:visible;mso-wrap-style:square;mso-left-percent:-10001;mso-top-percent:-10001;mso-position-horizontal:absolute;mso-position-horizontal-relative:char;mso-position-vertical:absolute;mso-position-vertical-relative:line;mso-left-percent:-10001;mso-top-percent:-10001;v-text-anchor:top" o:gfxdata="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" filled="f">
+              <v:rect w14:anchorId="3CCF7B05" id="Rectangle 5" o:spid="_x0000_s1026" style="width:468pt;height:.1pt;visibility:visible;mso-wrap-style:square;mso-left-percent:-10001;mso-top-percent:-10001;mso-position-horizontal:absolute;mso-position-horizontal-relative:char;mso-position-vertical:absolute;mso-position-vertical-relative:line;mso-left-percent:-10001;mso-top-percent:-10001;v-text-anchor:top" o:gfxdata="UEsDBBQABgAIAAAAIQBaIpOj/wAAAOUBAAATAAAAW0NvbnRlbnRfVHlwZXNdLnhtbJSRQU7DMBBF 90jcwZotSpx2gRBK0gVpl4BQOYBlTxKLZGx5TGhvj5NCF4gisbRn/n9Pdrk5jIOYMLB1VMEqL0Ag aWcsdRW87nfZHQiOiowaHGEFR2TY1NdX5f7okUVKE1fQx+jvpWTd46g4dx4pTVoXRhXTMXTSK/2m OpTroriV2lFEilmcO6AuG2zV+xDF9pCuTyYBBwbxcFqcWRUo7werVUymciLzg5J9EfKUXHa4t55v kgYI+StiGV0kfAef0uMEa1A8qxAf1ZhEpAksce0ap/O/S2bNkTPXtlZj3gTeLqmz1aVy4z4o4PTf 9ibFXnA618vlk+pPAAAA//8DAFBLAwQUAAYACAAAACEAp0rPONcAAACWAQAACwAAAF9yZWxzLy5y ZWxzpJDBasMwDIbvg72D0X1xmsMYo04vo9Br6R7A2IpjGltGMtn69jM7jGX0tqN+oe/70f7wmRa1 IkukbGDX9aAwO/IxBwPvl+PTCyipNnu7UEYDNxQ4jI8P+zMutrYjmWMR1ShZDMy1lletxc2YrHRU MLfNRJxsbSMHXay72oB66Ptnzb8ZMG6Y6uQN8MkPoC630sx/2Ck6JqGpdo6SpmmK7h5Ve/rIZ1wb xXLAasCzfIeMa9fKgdL3xbt/igPbMkd3ZJvwjdy2AA7Ush+/3nxz/AIAAP//AwBQSwMEFAAGAAgA AAAhAD6L9189AgAAeQQAAA4AAABkcnMvZTJvRG9jLnhtbKxU227bMAx9H7B/EPS+2s6SpjXqFEUv w4DuAnTDnhVZtoXJokYpcbKvHyU7l21vw2JAEEXxkIdHzM3trjdsq9BrsBUvLnLOlJVQa9tW/OuX pzdXnPkgbC0MWFXxvfL8dvX61c3gSjWDDkytkBGI9eXgKt6F4Mos87JTvfAX4JQlZwPYi0AmtlmN YiD03mSzPL/MBsDaIUjlPZ0+jE6+SvhNo2T41DReBWYqTrWFtGJa12nNVjeibFG4TsupDvEPZfRC W8p6hHoQQbAN6r+gei0RPDThQkKfQdNoqRIJolPkf9B56YRTiQx1x7tjn/z/g5Ufty/uM8bSvXsG +d0zC/edsK26Q4ShU6KmdAVn1KlscL48RkTDUyxbDx+gJnHFJkBqwq7BPiISPbZLbd6fmq12gUk6 nReXxXw5W3AmyVvMlqRPzCHKQ7hDH94p6FncVBxJzQQvts8+THcPd2I6C0/amOgQpbFsqPj1gvCj SQrXyYkQvunQpc7GmpLTE964YQ6I7XjssV3fG2RbQY/nLo/focLWn18v8vhLUL/FPL6N33kMkWsP yYy2jNpc8cV8jJ8YHUqNGXodaDyM7it+dbokyqjKo61HqkFoMxmEb+ykU5QmzoEv11DvSSainlSg caVNB/iTs4FefsX9j41AxZl5b4n9dTGfx1lJxnyxnJGB5571uUdYSVAVD5zYxO19GOdr41C3HWUq Umcs3NHzaPQo3KmsqVp63kn7aRTj/Jzb6dbpH2P1CwAA//8DAFBLAwQUAAYACAAAACEApvkTOdwA AAAIAQAADwAAAGRycy9kb3ducmV2LnhtbEyPwU7DMBBE70j9B2srcaNOi6ggjVOlQK+VKEjAzY0X O2q8jmK3CX/PwqVcRhqNdnZesR59K87YxyaQgvksA4FUB9OQVfD2ur25BxGTJqPbQKjgGyOsy8lV oXMTBnrB8z5ZwSUUc63ApdTlUsbaoddxFjokzr5C73Vi21tpej1wuW/lIsuW0uuG+IPTHT46rI/7 k1fw3H3uqjsbZfWe3McxbIat21mlrqfj04qlWoFIOKbLBfwy8H4oedghnMhE0SpgmvSnnD3cLtke FCxAyLKQ/wHKHwAAAP//AwBQSwECLQAUAAYACAAAACEAWiKTo/8AAADlAQAAEwAAAAAAAAAAAAAA AAAAAAAAW0NvbnRlbnRfVHlwZXNdLnhtbFBLAQItABQABgAIAAAAIQCnSs841wAAAJYBAAALAAAA AAAAAAAAAAAAADABAABfcmVscy8ucmVsc1BLAQItABQABgAIAAAAIQA+i/dfPQIAAHkEAAAOAAAA AAAAAAAAAAAAADACAABkcnMvZTJvRG9jLnhtbFBLAQItABQABgAIAAAAIQCm+RM53AAAAAgBAAAP AAAAAAAAAAAAAAAAAJkEAABkcnMvZG93bnJldi54bWxQSwUGAAAAAAQABADzAAAAogUAAAAA " filled="f">
                 <w10:anchorlock/>
               </v:rect>
             </w:pict>
@@ -4620,13 +4852,8 @@
       <w:pPr>
         <w:pStyle w:val="NormalWeb"/>
       </w:pPr>
-      <w:proofErr w:type="spellStart"/>
-      <w:r>
-        <w:t>TurnHub's</w:t>
-      </w:r>
-      <w:proofErr w:type="spellEnd"/>
-      <w:r>
-        <w:t xml:space="preserve"> goal is to help manage the table without requiring players to hand over unnecessary personal data.</w:t>
+      <w:r>
+        <w:t xml:space="preserve">TurnHub's goal is to help manage the table without requiring players to hand over unnecessary personal data.</w:t>
       </w:r>
     </w:p>
     <w:p>
@@ -4693,7 +4920,7 @@
           </mc:Choice>
           <mc:Fallback>
             <w:pict>
-              <v:rect w14:anchorId="0E7FC36B" id="Rectangle 4" o:spid="_x0000_s1026" style="width:468pt;height:.1pt;visibility:visible;mso-wrap-style:square;mso-left-percent:-10001;mso-top-percent:-10001;mso-position-horizontal:absolute;mso-position-horizontal-relative:char;mso-position-vertical:absolute;mso-position-vertical-relative:line;mso-left-percent:-10001;mso-top-percent:-10001;v-text-anchor:top" o:gfxdata="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" filled="f">
+              <v:rect w14:anchorId="0E7FC36B" id="Rectangle 4" o:spid="_x0000_s1026" style="width:468pt;height:.1pt;visibility:visible;mso-wrap-style:square;mso-left-percent:-10001;mso-top-percent:-10001;mso-position-horizontal:absolute;mso-position-horizontal-relative:char;mso-position-vertical:absolute;mso-position-vertical-relative:line;mso-left-percent:-10001;mso-top-percent:-10001;v-text-anchor:top" o:gfxdata="UEsDBBQABgAIAAAAIQBaIpOj/wAAAOUBAAATAAAAW0NvbnRlbnRfVHlwZXNdLnhtbJSRQU7DMBBF 90jcwZotSpx2gRBK0gVpl4BQOYBlTxKLZGx5TGhvj5NCF4gisbRn/n9Pdrk5jIOYMLB1VMEqL0Ag aWcsdRW87nfZHQiOiowaHGEFR2TY1NdX5f7okUVKE1fQx+jvpWTd46g4dx4pTVoXRhXTMXTSK/2m OpTroriV2lFEilmcO6AuG2zV+xDF9pCuTyYBBwbxcFqcWRUo7werVUymciLzg5J9EfKUXHa4t55v kgYI+StiGV0kfAef0uMEa1A8qxAf1ZhEpAksce0ap/O/S2bNkTPXtlZj3gTeLqmz1aVy4z4o4PTf 9ibFXnA618vlk+pPAAAA//8DAFBLAwQUAAYACAAAACEAp0rPONcAAACWAQAACwAAAF9yZWxzLy5y ZWxzpJDBasMwDIbvg72D0X1xmsMYo04vo9Br6R7A2IpjGltGMtn69jM7jGX0tqN+oe/70f7wmRa1 IkukbGDX9aAwO/IxBwPvl+PTCyipNnu7UEYDNxQ4jI8P+zMutrYjmWMR1ShZDMy1lletxc2YrHRU MLfNRJxsbSMHXay72oB66Ptnzb8ZMG6Y6uQN8MkPoC630sx/2Ck6JqGpdo6SpmmK7h5Ve/rIZ1wb xXLAasCzfIeMa9fKgdL3xbt/igPbMkd3ZJvwjdy2AA7Ush+/3nxz/AIAAP//AwBQSwMEFAAGAAgA AAAhAD6L9189AgAAeQQAAA4AAABkcnMvZTJvRG9jLnhtbKxU227bMAx9H7B/EPS+2s6SpjXqFEUv w4DuAnTDnhVZtoXJokYpcbKvHyU7l21vw2JAEEXxkIdHzM3trjdsq9BrsBUvLnLOlJVQa9tW/OuX pzdXnPkgbC0MWFXxvfL8dvX61c3gSjWDDkytkBGI9eXgKt6F4Mos87JTvfAX4JQlZwPYi0AmtlmN YiD03mSzPL/MBsDaIUjlPZ0+jE6+SvhNo2T41DReBWYqTrWFtGJa12nNVjeibFG4TsupDvEPZfRC W8p6hHoQQbAN6r+gei0RPDThQkKfQdNoqRIJolPkf9B56YRTiQx1x7tjn/z/g5Ufty/uM8bSvXsG +d0zC/edsK26Q4ShU6KmdAVn1KlscL48RkTDUyxbDx+gJnHFJkBqwq7BPiISPbZLbd6fmq12gUk6 nReXxXw5W3AmyVvMlqRPzCHKQ7hDH94p6FncVBxJzQQvts8+THcPd2I6C0/amOgQpbFsqPj1gvCj SQrXyYkQvunQpc7GmpLTE964YQ6I7XjssV3fG2RbQY/nLo/focLWn18v8vhLUL/FPL6N33kMkWsP yYy2jNpc8cV8jJ8YHUqNGXodaDyM7it+dbokyqjKo61HqkFoMxmEb+ykU5QmzoEv11DvSSainlSg caVNB/iTs4FefsX9j41AxZl5b4n9dTGfx1lJxnyxnJGB5571uUdYSVAVD5zYxO19GOdr41C3HWUq Umcs3NHzaPQo3KmsqVp63kn7aRTj/Jzb6dbpH2P1CwAA//8DAFBLAwQUAAYACAAAACEApvkTOdwA AAAIAQAADwAAAGRycy9kb3ducmV2LnhtbEyPwU7DMBBE70j9B2srcaNOi6ggjVOlQK+VKEjAzY0X O2q8jmK3CX/PwqVcRhqNdnZesR59K87YxyaQgvksA4FUB9OQVfD2ur25BxGTJqPbQKjgGyOsy8lV oXMTBnrB8z5ZwSUUc63ApdTlUsbaoddxFjokzr5C73Vi21tpej1wuW/lIsuW0uuG+IPTHT46rI/7 k1fw3H3uqjsbZfWe3McxbIat21mlrqfj04qlWoFIOKbLBfwy8H4oedghnMhE0SpgmvSnnD3cLtke FCxAyLKQ/wHKHwAAAP//AwBQSwECLQAUAAYACAAAACEAWiKTo/8AAADlAQAAEwAAAAAAAAAAAAAA AAAAAAAAW0NvbnRlbnRfVHlwZXNdLnhtbFBLAQItABQABgAIAAAAIQCnSs841wAAAJYBAAALAAAA AAAAAAAAAAAAADABAABfcmVscy8ucmVsc1BLAQItABQABgAIAAAAIQA+i/dfPQIAAHkEAAAOAAAA AAAAAAAAAAAAADACAABkcnMvZTJvRG9jLnhtbFBLAQItABQABgAIAAAAIQCm+RM53AAAAAgBAAAP AAAAAAAAAAAAAAAAAJkEAABkcnMvZG93bnJldi54bWxQSwUGAAAAAAQABADzAAAAogUAAAAA " filled="f">
                 <w10:anchorlock/>
               </v:rect>
             </w:pict>
@@ -5091,6 +5318,36 @@
       <w:r>
         <w:t>Tap or click the TurnHub interface once, then try again.</w:t>
       </w:r>
+    </w:p>
+    <w:p>
+      <w:pPr>
+        <w:pStyle w:val="Heading2"/>
+        <w:rPr>
+          <w:ins w:id="9131" w:author="Claude" w:date="2026-09-24T12:00:00Z"/>
+          <w:rFonts w:eastAsia="Times New Roman"/>
+        </w:rPr>
+      </w:pPr>
+      <w:ins w:id="9132" w:author="Claude" w:date="2026-09-24T12:00:00Z">
+        <w:r>
+          <w:rPr>
+            <w:rFonts w:eastAsia="Times New Roman"/>
+          </w:rPr>
+          <w:t>My Sigil Needs a Longer Press Than Expected</w:t>
+        </w:r>
+      </w:ins>
+    </w:p>
+    <w:p>
+      <w:pPr>
+        <w:pStyle w:val="NormalWeb"/>
+        <w:rPr>
+          <w:ins w:id="9133" w:author="Claude" w:date="2026-09-24T12:00:00Z"/>
+        </w:rPr>
+      </w:pPr>
+      <w:ins w:id="9134" w:author="Claude" w:date="2026-09-24T12:00:00Z">
+        <w:r>
+          <w:t xml:space="preserve">Hold times can be lengthened in Sigil accessibility. If two players share the Sigil, the longer of their hold times applies. You can also pause or claim a win from the browser or the app.</w:t>
+        </w:r>
+      </w:ins>
     </w:p>
     <w:p>
       <w:pPr>
@@ -5156,7 +5413,7 @@
           </mc:Choice>
           <mc:Fallback>
             <w:pict>
-              <v:rect w14:anchorId="004EA1A3" id="Rectangle 3" o:spid="_x0000_s1026" style="width:468pt;height:.1pt;visibility:visible;mso-wrap-style:square;mso-left-percent:-10001;mso-top-percent:-10001;mso-position-horizontal:absolute;mso-position-horizontal-relative:char;mso-position-vertical:absolute;mso-position-vertical-relative:line;mso-left-percent:-10001;mso-top-percent:-10001;v-text-anchor:top" o:gfxdata="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" filled="f">
+              <v:rect w14:anchorId="004EA1A3" id="Rectangle 3" o:spid="_x0000_s1026" style="width:468pt;height:.1pt;visibility:visible;mso-wrap-style:square;mso-left-percent:-10001;mso-top-percent:-10001;mso-position-horizontal:absolute;mso-position-horizontal-relative:char;mso-position-vertical:absolute;mso-position-vertical-relative:line;mso-left-percent:-10001;mso-top-percent:-10001;v-text-anchor:top" o:gfxdata="UEsDBBQABgAIAAAAIQBaIpOj/wAAAOUBAAATAAAAW0NvbnRlbnRfVHlwZXNdLnhtbJSRQU7DMBBF 90jcwZotSpx2gRBK0gVpl4BQOYBlTxKLZGx5TGhvj5NCF4gisbRn/n9Pdrk5jIOYMLB1VMEqL0Ag aWcsdRW87nfZHQiOiowaHGEFR2TY1NdX5f7okUVKE1fQx+jvpWTd46g4dx4pTVoXRhXTMXTSK/2m OpTroriV2lFEilmcO6AuG2zV+xDF9pCuTyYBBwbxcFqcWRUo7werVUymciLzg5J9EfKUXHa4t55v kgYI+StiGV0kfAef0uMEa1A8qxAf1ZhEpAksce0ap/O/S2bNkTPXtlZj3gTeLqmz1aVy4z4o4PTf 9ibFXnA618vlk+pPAAAA//8DAFBLAwQUAAYACAAAACEAp0rPONcAAACWAQAACwAAAF9yZWxzLy5y ZWxzpJDBasMwDIbvg72D0X1xmsMYo04vo9Br6R7A2IpjGltGMtn69jM7jGX0tqN+oe/70f7wmRa1 IkukbGDX9aAwO/IxBwPvl+PTCyipNnu7UEYDNxQ4jI8P+zMutrYjmWMR1ShZDMy1lletxc2YrHRU MLfNRJxsbSMHXay72oB66Ptnzb8ZMG6Y6uQN8MkPoC630sx/2Ck6JqGpdo6SpmmK7h5Ve/rIZ1wb xXLAasCzfIeMa9fKgdL3xbt/igPbMkd3ZJvwjdy2AA7Ush+/3nxz/AIAAP//AwBQSwMEFAAGAAgA AAAhAD6L9189AgAAeQQAAA4AAABkcnMvZTJvRG9jLnhtbKxU227bMAx9H7B/EPS+2s6SpjXqFEUv w4DuAnTDnhVZtoXJokYpcbKvHyU7l21vw2JAEEXxkIdHzM3trjdsq9BrsBUvLnLOlJVQa9tW/OuX pzdXnPkgbC0MWFXxvfL8dvX61c3gSjWDDkytkBGI9eXgKt6F4Mos87JTvfAX4JQlZwPYi0AmtlmN YiD03mSzPL/MBsDaIUjlPZ0+jE6+SvhNo2T41DReBWYqTrWFtGJa12nNVjeibFG4TsupDvEPZfRC W8p6hHoQQbAN6r+gei0RPDThQkKfQdNoqRIJolPkf9B56YRTiQx1x7tjn/z/g5Ufty/uM8bSvXsG +d0zC/edsK26Q4ShU6KmdAVn1KlscL48RkTDUyxbDx+gJnHFJkBqwq7BPiISPbZLbd6fmq12gUk6 nReXxXw5W3AmyVvMlqRPzCHKQ7hDH94p6FncVBxJzQQvts8+THcPd2I6C0/amOgQpbFsqPj1gvCj SQrXyYkQvunQpc7GmpLTE964YQ6I7XjssV3fG2RbQY/nLo/focLWn18v8vhLUL/FPL6N33kMkWsP yYy2jNpc8cV8jJ8YHUqNGXodaDyM7it+dbokyqjKo61HqkFoMxmEb+ykU5QmzoEv11DvSSainlSg caVNB/iTs4FefsX9j41AxZl5b4n9dTGfx1lJxnyxnJGB5571uUdYSVAVD5zYxO19GOdr41C3HWUq Umcs3NHzaPQo3KmsqVp63kn7aRTj/Jzb6dbpH2P1CwAA//8DAFBLAwQUAAYACAAAACEApvkTOdwA AAAIAQAADwAAAGRycy9kb3ducmV2LnhtbEyPwU7DMBBE70j9B2srcaNOi6ggjVOlQK+VKEjAzY0X O2q8jmK3CX/PwqVcRhqNdnZesR59K87YxyaQgvksA4FUB9OQVfD2ur25BxGTJqPbQKjgGyOsy8lV oXMTBnrB8z5ZwSUUc63ApdTlUsbaoddxFjokzr5C73Vi21tpej1wuW/lIsuW0uuG+IPTHT46rI/7 k1fw3H3uqjsbZfWe3McxbIat21mlrqfj04qlWoFIOKbLBfwy8H4oedghnMhE0SpgmvSnnD3cLtke FCxAyLKQ/wHKHwAAAP//AwBQSwECLQAUAAYACAAAACEAWiKTo/8AAADlAQAAEwAAAAAAAAAAAAAA AAAAAAAAW0NvbnRlbnRfVHlwZXNdLnhtbFBLAQItABQABgAIAAAAIQCnSs841wAAAJYBAAALAAAA AAAAAAAAAAAAADABAABfcmVscy8ucmVsc1BLAQItABQABgAIAAAAIQA+i/dfPQIAAHkEAAAOAAAA AAAAAAAAAAAAADACAABkcnMvZTJvRG9jLnhtbFBLAQItABQABgAIAAAAIQCm+RM53AAAAAgBAAAP AAAAAAAAAAAAAAAAAJkEAABkcnMvZG93bnJldi54bWxQSwUGAAAAAAQABADzAAAAogUAAAAA " filled="f">
                 <w10:anchorlock/>
               </v:rect>
             </w:pict>
@@ -5492,7 +5749,7 @@
           </mc:Choice>
           <mc:Fallback>
             <w:pict>
-              <v:rect w14:anchorId="4D3274B2" id="Rectangle 2" o:spid="_x0000_s1026" style="width:468pt;height:.1pt;visibility:visible;mso-wrap-style:square;mso-left-percent:-10001;mso-top-percent:-10001;mso-position-horizontal:absolute;mso-position-horizontal-relative:char;mso-position-vertical:absolute;mso-position-vertical-relative:line;mso-left-percent:-10001;mso-top-percent:-10001;v-text-anchor:top" o:gfxdata="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" filled="f">
+              <v:rect w14:anchorId="4D3274B2" id="Rectangle 2" o:spid="_x0000_s1026" style="width:468pt;height:.1pt;visibility:visible;mso-wrap-style:square;mso-left-percent:-10001;mso-top-percent:-10001;mso-position-horizontal:absolute;mso-position-horizontal-relative:char;mso-position-vertical:absolute;mso-position-vertical-relative:line;mso-left-percent:-10001;mso-top-percent:-10001;v-text-anchor:top" o:gfxdata="UEsDBBQABgAIAAAAIQBaIpOj/wAAAOUBAAATAAAAW0NvbnRlbnRfVHlwZXNdLnhtbJSRQU7DMBBF 90jcwZotSpx2gRBK0gVpl4BQOYBlTxKLZGx5TGhvj5NCF4gisbRn/n9Pdrk5jIOYMLB1VMEqL0Ag aWcsdRW87nfZHQiOiowaHGEFR2TY1NdX5f7okUVKE1fQx+jvpWTd46g4dx4pTVoXRhXTMXTSK/2m OpTroriV2lFEilmcO6AuG2zV+xDF9pCuTyYBBwbxcFqcWRUo7werVUymciLzg5J9EfKUXHa4t55v kgYI+StiGV0kfAef0uMEa1A8qxAf1ZhEpAksce0ap/O/S2bNkTPXtlZj3gTeLqmz1aVy4z4o4PTf 9ibFXnA618vlk+pPAAAA//8DAFBLAwQUAAYACAAAACEAp0rPONcAAACWAQAACwAAAF9yZWxzLy5y ZWxzpJDBasMwDIbvg72D0X1xmsMYo04vo9Br6R7A2IpjGltGMtn69jM7jGX0tqN+oe/70f7wmRa1 IkukbGDX9aAwO/IxBwPvl+PTCyipNnu7UEYDNxQ4jI8P+zMutrYjmWMR1ShZDMy1lletxc2YrHRU MLfNRJxsbSMHXay72oB66Ptnzb8ZMG6Y6uQN8MkPoC630sx/2Ck6JqGpdo6SpmmK7h5Ve/rIZ1wb xXLAasCzfIeMa9fKgdL3xbt/igPbMkd3ZJvwjdy2AA7Ush+/3nxz/AIAAP//AwBQSwMEFAAGAAgA AAAhAD6L9189AgAAeQQAAA4AAABkcnMvZTJvRG9jLnhtbKxU227bMAx9H7B/EPS+2s6SpjXqFEUv w4DuAnTDnhVZtoXJokYpcbKvHyU7l21vw2JAEEXxkIdHzM3trjdsq9BrsBUvLnLOlJVQa9tW/OuX pzdXnPkgbC0MWFXxvfL8dvX61c3gSjWDDkytkBGI9eXgKt6F4Mos87JTvfAX4JQlZwPYi0AmtlmN YiD03mSzPL/MBsDaIUjlPZ0+jE6+SvhNo2T41DReBWYqTrWFtGJa12nNVjeibFG4TsupDvEPZfRC W8p6hHoQQbAN6r+gei0RPDThQkKfQdNoqRIJolPkf9B56YRTiQx1x7tjn/z/g5Ufty/uM8bSvXsG +d0zC/edsK26Q4ShU6KmdAVn1KlscL48RkTDUyxbDx+gJnHFJkBqwq7BPiISPbZLbd6fmq12gUk6 nReXxXw5W3AmyVvMlqRPzCHKQ7hDH94p6FncVBxJzQQvts8+THcPd2I6C0/amOgQpbFsqPj1gvCj SQrXyYkQvunQpc7GmpLTE964YQ6I7XjssV3fG2RbQY/nLo/focLWn18v8vhLUL/FPL6N33kMkWsP yYy2jNpc8cV8jJ8YHUqNGXodaDyM7it+dbokyqjKo61HqkFoMxmEb+ykU5QmzoEv11DvSSainlSg caVNB/iTs4FefsX9j41AxZl5b4n9dTGfx1lJxnyxnJGB5571uUdYSVAVD5zYxO19GOdr41C3HWUq Umcs3NHzaPQo3KmsqVp63kn7aRTj/Jzb6dbpH2P1CwAA//8DAFBLAwQUAAYACAAAACEApvkTOdwA AAAIAQAADwAAAGRycy9kb3ducmV2LnhtbEyPwU7DMBBE70j9B2srcaNOi6ggjVOlQK+VKEjAzY0X O2q8jmK3CX/PwqVcRhqNdnZesR59K87YxyaQgvksA4FUB9OQVfD2ur25BxGTJqPbQKjgGyOsy8lV oXMTBnrB8z5ZwSUUc63ApdTlUsbaoddxFjokzr5C73Vi21tpej1wuW/lIsuW0uuG+IPTHT46rI/7 k1fw3H3uqjsbZfWe3McxbIat21mlrqfj04qlWoFIOKbLBfwy8H4oedghnMhE0SpgmvSnnD3cLtke FCxAyLKQ/wHKHwAAAP//AwBQSwECLQAUAAYACAAAACEAWiKTo/8AAADlAQAAEwAAAAAAAAAAAAAA AAAAAAAAW0NvbnRlbnRfVHlwZXNdLnhtbFBLAQItABQABgAIAAAAIQCnSs841wAAAJYBAAALAAAA AAAAAAAAAAAAADABAABfcmVscy8ucmVsc1BLAQItABQABgAIAAAAIQA+i/dfPQIAAHkEAAAOAAAA AAAAAAAAAAAAADACAABkcnMvZTJvRG9jLnhtbFBLAQItABQABgAIAAAAIQCm+RM53AAAAAgBAAAP AAAAAAAAAAAAAAAAAJkEAABkcnMvZG93bnJldi54bWxQSwUGAAAAAAQABADzAAAAogUAAAAA " filled="f">
                 <w10:anchorlock/>
               </v:rect>
             </w:pict>
@@ -5621,7 +5878,7 @@
           </mc:Choice>
           <mc:Fallback>
             <w:pict>
-              <v:rect w14:anchorId="2C66DC7C" id="Rectangle 1" o:spid="_x0000_s1026" style="width:468pt;height:.1pt;visibility:visible;mso-wrap-style:square;mso-left-percent:-10001;mso-top-percent:-10001;mso-position-horizontal:absolute;mso-position-horizontal-relative:char;mso-position-vertical:absolute;mso-position-vertical-relative:line;mso-left-percent:-10001;mso-top-percent:-10001;v-text-anchor:top" o:gfxdata="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" filled="f">
+              <v:rect w14:anchorId="2C66DC7C" id="Rectangle 1" o:spid="_x0000_s1026" style="width:468pt;height:.1pt;visibility:visible;mso-wrap-style:square;mso-left-percent:-10001;mso-top-percent:-10001;mso-position-horizontal:absolute;mso-position-horizontal-relative:char;mso-position-vertical:absolute;mso-position-vertical-relative:line;mso-left-percent:-10001;mso-top-percent:-10001;v-text-anchor:top" o:gfxdata="UEsDBBQABgAIAAAAIQBaIpOj/wAAAOUBAAATAAAAW0NvbnRlbnRfVHlwZXNdLnhtbJSRQU7DMBBF 90jcwZotSpx2gRBK0gVpl4BQOYBlTxKLZGx5TGhvj5NCF4gisbRn/n9Pdrk5jIOYMLB1VMEqL0Ag aWcsdRW87nfZHQiOiowaHGEFR2TY1NdX5f7okUVKE1fQx+jvpWTd46g4dx4pTVoXRhXTMXTSK/2m OpTroriV2lFEilmcO6AuG2zV+xDF9pCuTyYBBwbxcFqcWRUo7werVUymciLzg5J9EfKUXHa4t55v kgYI+StiGV0kfAef0uMEa1A8qxAf1ZhEpAksce0ap/O/S2bNkTPXtlZj3gTeLqmz1aVy4z4o4PTf 9ibFXnA618vlk+pPAAAA//8DAFBLAwQUAAYACAAAACEAp0rPONcAAACWAQAACwAAAF9yZWxzLy5y ZWxzpJDBasMwDIbvg72D0X1xmsMYo04vo9Br6R7A2IpjGltGMtn69jM7jGX0tqN+oe/70f7wmRa1 IkukbGDX9aAwO/IxBwPvl+PTCyipNnu7UEYDNxQ4jI8P+zMutrYjmWMR1ShZDMy1lletxc2YrHRU MLfNRJxsbSMHXay72oB66Ptnzb8ZMG6Y6uQN8MkPoC630sx/2Ck6JqGpdo6SpmmK7h5Ve/rIZ1wb xXLAasCzfIeMa9fKgdL3xbt/igPbMkd3ZJvwjdy2AA7Ush+/3nxz/AIAAP//AwBQSwMEFAAGAAgA AAAhAD6L9189AgAAeQQAAA4AAABkcnMvZTJvRG9jLnhtbKxU227bMAx9H7B/EPS+2s6SpjXqFEUv w4DuAnTDnhVZtoXJokYpcbKvHyU7l21vw2JAEEXxkIdHzM3trjdsq9BrsBUvLnLOlJVQa9tW/OuX pzdXnPkgbC0MWFXxvfL8dvX61c3gSjWDDkytkBGI9eXgKt6F4Mos87JTvfAX4JQlZwPYi0AmtlmN YiD03mSzPL/MBsDaIUjlPZ0+jE6+SvhNo2T41DReBWYqTrWFtGJa12nNVjeibFG4TsupDvEPZfRC W8p6hHoQQbAN6r+gei0RPDThQkKfQdNoqRIJolPkf9B56YRTiQx1x7tjn/z/g5Ufty/uM8bSvXsG +d0zC/edsK26Q4ShU6KmdAVn1KlscL48RkTDUyxbDx+gJnHFJkBqwq7BPiISPbZLbd6fmq12gUk6 nReXxXw5W3AmyVvMlqRPzCHKQ7hDH94p6FncVBxJzQQvts8+THcPd2I6C0/amOgQpbFsqPj1gvCj SQrXyYkQvunQpc7GmpLTE964YQ6I7XjssV3fG2RbQY/nLo/focLWn18v8vhLUL/FPL6N33kMkWsP yYy2jNpc8cV8jJ8YHUqNGXodaDyM7it+dbokyqjKo61HqkFoMxmEb+ykU5QmzoEv11DvSSainlSg caVNB/iTs4FefsX9j41AxZl5b4n9dTGfx1lJxnyxnJGB5571uUdYSVAVD5zYxO19GOdr41C3HWUq Umcs3NHzaPQo3KmsqVp63kn7aRTj/Jzb6dbpH2P1CwAA//8DAFBLAwQUAAYACAAAACEApvkTOdwA AAAIAQAADwAAAGRycy9kb3ducmV2LnhtbEyPwU7DMBBE70j9B2srcaNOi6ggjVOlQK+VKEjAzY0X O2q8jmK3CX/PwqVcRhqNdnZesR59K87YxyaQgvksA4FUB9OQVfD2ur25BxGTJqPbQKjgGyOsy8lV oXMTBnrB8z5ZwSUUc63ApdTlUsbaoddxFjokzr5C73Vi21tpej1wuW/lIsuW0uuG+IPTHT46rI/7 k1fw3H3uqjsbZfWe3McxbIat21mlrqfj04qlWoFIOKbLBfwy8H4oedghnMhE0SpgmvSnnD3cLtke FCxAyLKQ/wHKHwAAAP//AwBQSwECLQAUAAYACAAAACEAWiKTo/8AAADlAQAAEwAAAAAAAAAAAAAA AAAAAAAAW0NvbnRlbnRfVHlwZXNdLnhtbFBLAQItABQABgAIAAAAIQCnSs841wAAAJYBAAALAAAA AAAAAAAAAAAAADABAABfcmVscy8ucmVsc1BLAQItABQABgAIAAAAIQA+i/dfPQIAAHkEAAAOAAAA AAAAAAAAAAAAADACAABkcnMvZTJvRG9jLnhtbFBLAQItABQABgAIAAAAIQCm+RM53AAAAAgBAAAP AAAAAAAAAAAAAAAAAJkEAABkcnMvZG93bnJldi54bWxQSwUGAAAAAAQABADzAAAAogUAAAAA " filled="f">
                 <w10:anchorlock/>
               </v:rect>
             </w:pict>
@@ -5654,12 +5911,7 @@
         <w:t>Manual Version:</w:t>
       </w:r>
       <w:r>
-        <w:t xml:space="preserve"> 0.</w:t>
-      </w:r>
-      <w:r>
-        <w:t>2</w:t>
-      </w:r>
-      <w:r>
+        <w:t xml:space="preserve"> 0.2</w:t>
         <w:br/>
       </w:r>
       <w:r>
@@ -5670,8 +5922,6 @@
       </w:r>
       <w:r>
         <w:t xml:space="preserve"> Prototype</w:t>
-      </w:r>
-      <w:r>
         <w:br/>
       </w:r>
       <w:r>
@@ -5682,8 +5932,6 @@
       </w:r>
       <w:r>
         <w:t xml:space="preserve"> Development Build</w:t>
-      </w:r>
-      <w:r>
         <w:br/>
         <w:t>**Product names and specifications subject to change.</w:t>
       </w:r>

</xml_diff>

<commit_message>
Manual V0.2: draw ending, forgetting a Sigil, pairing window (tracked changes)
Tracked insertions (author Claude): Atlas's adjustable pairing window,
forgetting a Sigil on the Sigil and in Device Settings, ending a match as a
draw with the Atlas master button, and matching troubleshooting tips.

Co-Authored-By: Claude Opus 5.5 <noreply@anthropic.com>
Claude-Session: https://claude.ai/code/session_01BytwGTB1MLHW7dKfsMNh7M
</commit_message>
<xml_diff>
--- a/Documentation/User Manual/TurnHub Manual V0.2.docx
+++ b/Documentation/User Manual/TurnHub Manual V0.2.docx
@@ -1248,6 +1248,14 @@
         </w:rPr>
         <w:t>.</w:t>
       </w:r>
+      <w:ins w:id="9601" w:author="Claude" w:date="2026-09-24T18:00:00Z">
+        <w:r>
+          <w:rPr>
+            <w:rFonts w:eastAsia="Times New Roman"/>
+          </w:rPr>
+          <w:t xml:space="preserve"> An administrator can lengthen Atlas’s window to 30 or 60 seconds under Device Settings. The Sigil’s own window is always 15 seconds, so with a longer window press Pair on Atlas first, then on the Sigil.</w:t>
+        </w:r>
+      </w:ins>
     </w:p>
     <w:p>
       <w:pPr>
@@ -1331,6 +1339,113 @@
       <w:r>
         <w:t>Pairing acknowledgements are intentionally limited so TurnHub does not repeatedly generate unnecessary alerts during normal play.</w:t>
       </w:r>
+    </w:p>
+    <w:p>
+      <w:pPr>
+        <w:pStyle w:val="Heading2"/>
+        <w:rPr>
+          <w:ins w:id="9602" w:author="Claude" w:date="2026-09-24T18:00:00Z"/>
+          <w:rFonts w:eastAsia="Times New Roman"/>
+        </w:rPr>
+      </w:pPr>
+      <w:ins w:id="9603" w:author="Claude" w:date="2026-09-24T18:00:00Z">
+        <w:r>
+          <w:rPr>
+            <w:rFonts w:eastAsia="Times New Roman"/>
+          </w:rPr>
+          <w:t xml:space="preserve">Forgetting a Sigil</w:t>
+        </w:r>
+      </w:ins>
+    </w:p>
+    <w:p>
+      <w:pPr>
+        <w:pStyle w:val="NormalWeb"/>
+        <w:rPr>
+          <w:ins w:id="9604" w:author="Claude" w:date="2026-09-24T18:00:00Z"/>
+        </w:rPr>
+      </w:pPr>
+      <w:ins w:id="9605" w:author="Claude" w:date="2026-09-24T18:00:00Z">
+        <w:r>
+          <w:rPr/>
+          <w:t xml:space="preserve">A paired Sigil stays paired through restarts. To remove a pairing:</w:t>
+        </w:r>
+      </w:ins>
+    </w:p>
+    <w:p>
+      <w:pPr>
+        <w:numPr>
+          <w:ilvl w:val="0"/>
+          <w:numId w:val="5"/>
+        </w:numPr>
+        <w:spacing w:before="100" w:beforeAutospacing="1" w:after="100" w:afterAutospacing="1" w:line="240" w:lineRule="auto"/>
+        <w:rPr>
+          <w:ins w:id="9606" w:author="Claude" w:date="2026-09-24T18:00:00Z"/>
+          <w:rFonts w:eastAsia="Times New Roman"/>
+        </w:rPr>
+      </w:pPr>
+      <w:ins w:id="9607" w:author="Claude" w:date="2026-09-24T18:00:00Z">
+        <w:r>
+          <w:rPr>
+            <w:rFonts w:eastAsia="Times New Roman"/>
+            <w:b/>
+            <w:bCs/>
+          </w:rPr>
+          <w:t xml:space="preserve">On the Sigil: </w:t>
+        </w:r>
+      </w:ins>
+      <w:ins w:id="9608" w:author="Claude" w:date="2026-09-24T18:00:00Z">
+        <w:r>
+          <w:rPr>
+            <w:rFonts w:eastAsia="Times New Roman"/>
+          </w:rPr>
+          <w:t xml:space="preserve">hold its Pair button for 10 seconds. A short press only opens the pairing window; after 10 seconds the Sigil forgets Atlas, its lights go off and its screen shows “Unpaired”.</w:t>
+        </w:r>
+      </w:ins>
+    </w:p>
+    <w:p>
+      <w:pPr>
+        <w:numPr>
+          <w:ilvl w:val="0"/>
+          <w:numId w:val="5"/>
+        </w:numPr>
+        <w:spacing w:before="100" w:beforeAutospacing="1" w:after="100" w:afterAutospacing="1" w:line="240" w:lineRule="auto"/>
+        <w:rPr>
+          <w:ins w:id="9609" w:author="Claude" w:date="2026-09-24T18:00:00Z"/>
+          <w:rFonts w:eastAsia="Times New Roman"/>
+        </w:rPr>
+      </w:pPr>
+      <w:ins w:id="9610" w:author="Claude" w:date="2026-09-24T18:00:00Z">
+        <w:r>
+          <w:rPr>
+            <w:rFonts w:eastAsia="Times New Roman"/>
+            <w:b/>
+            <w:bCs/>
+          </w:rPr>
+          <w:t xml:space="preserve">On Atlas: </w:t>
+        </w:r>
+      </w:ins>
+      <w:ins w:id="9611" w:author="Claude" w:date="2026-09-24T18:00:00Z">
+        <w:r>
+          <w:rPr>
+            <w:rFonts w:eastAsia="Times New Roman"/>
+          </w:rPr>
+          <w:t xml:space="preserve">an administrator opens Device Settings in the browser and chooses Forget next to a Sigil, or Forget all Sigils. This works in the lobby, for Sigils nobody is seated on. A Sigil that is switched on and in range also forgets Atlas.</w:t>
+        </w:r>
+      </w:ins>
+    </w:p>
+    <w:p>
+      <w:pPr>
+        <w:pStyle w:val="NormalWeb"/>
+        <w:rPr>
+          <w:ins w:id="9612" w:author="Claude" w:date="2026-09-24T18:00:00Z"/>
+        </w:rPr>
+      </w:pPr>
+      <w:ins w:id="9613" w:author="Claude" w:date="2026-09-24T18:00:00Z">
+        <w:r>
+          <w:rPr/>
+          <w:t xml:space="preserve">A forgotten Sigil can be paired again at any time with the Pair buttons.</w:t>
+        </w:r>
+      </w:ins>
     </w:p>
     <w:p>
       <w:pPr>
@@ -3531,6 +3646,51 @@
     </w:p>
     <w:p>
       <w:pPr>
+        <w:pStyle w:val="Heading2"/>
+        <w:rPr>
+          <w:ins w:id="9614" w:author="Claude" w:date="2026-09-24T18:00:00Z"/>
+          <w:rFonts w:eastAsia="Times New Roman"/>
+        </w:rPr>
+      </w:pPr>
+      <w:ins w:id="9615" w:author="Claude" w:date="2026-09-24T18:00:00Z">
+        <w:r>
+          <w:rPr>
+            <w:rFonts w:eastAsia="Times New Roman"/>
+          </w:rPr>
+          <w:t xml:space="preserve">Ending a Match as a Draw</w:t>
+        </w:r>
+      </w:ins>
+    </w:p>
+    <w:p>
+      <w:pPr>
+        <w:pStyle w:val="NormalWeb"/>
+        <w:rPr>
+          <w:ins w:id="9616" w:author="Claude" w:date="2026-09-24T18:00:00Z"/>
+        </w:rPr>
+      </w:pPr>
+      <w:ins w:id="9617" w:author="Claude" w:date="2026-09-24T18:00:00Z">
+        <w:r>
+          <w:rPr/>
+          <w:t xml:space="preserve">If a match cannot or should not be finished, for example after a power cut, hold the master button on Atlas for 5 seconds while the game is running or paused. From about one second into the hold, Atlas’s status light blinks quickly to show the hold is counting. A shorter press still passes the turn as usual.</w:t>
+        </w:r>
+      </w:ins>
+    </w:p>
+    <w:p>
+      <w:pPr>
+        <w:pStyle w:val="NormalWeb"/>
+        <w:rPr>
+          <w:ins w:id="9618" w:author="Claude" w:date="2026-09-24T18:00:00Z"/>
+        </w:rPr>
+      </w:pPr>
+      <w:ins w:id="9619" w:author="Claude" w:date="2026-09-24T18:00:00Z">
+        <w:r>
+          <w:rPr/>
+          <w:t xml:space="preserve">The match ends with no winner. Every player’s statistics count one game played, with the result shown as a draw (players who had already conceded keep their result). The browser and the app show “Draw”. Any win claim, pending pass or elimination choice is cancelled.</w:t>
+        </w:r>
+      </w:ins>
+    </w:p>
+    <w:p>
+      <w:pPr>
         <w:rPr>
           <w:rFonts w:eastAsia="Times New Roman"/>
         </w:rPr>
@@ -5009,6 +5169,14 @@
         </w:rPr>
         <w:t>Pair the Sigil within the 15-second pairing window.</w:t>
       </w:r>
+      <w:ins w:id="9622" w:author="Claude" w:date="2026-09-24T18:00:00Z">
+        <w:r>
+          <w:rPr>
+            <w:rFonts w:eastAsia="Times New Roman"/>
+          </w:rPr>
+          <w:t xml:space="preserve"> If you need more time, an administrator can lengthen Atlas’s window under Device Settings.</w:t>
+        </w:r>
+      </w:ins>
     </w:p>
     <w:p>
       <w:pPr>
@@ -5045,6 +5213,27 @@
         </w:rPr>
         <w:t>Restart the Sigil if necessary.</w:t>
       </w:r>
+    </w:p>
+    <w:p>
+      <w:pPr>
+        <w:numPr>
+          <w:ilvl w:val="0"/>
+          <w:numId w:val="18"/>
+        </w:numPr>
+        <w:spacing w:before="100" w:beforeAutospacing="1" w:after="100" w:afterAutospacing="1" w:line="240" w:lineRule="auto"/>
+        <w:rPr>
+          <w:ins w:id="9620" w:author="Claude" w:date="2026-09-24T18:00:00Z"/>
+          <w:rFonts w:eastAsia="Times New Roman"/>
+        </w:rPr>
+      </w:pPr>
+      <w:ins w:id="9621" w:author="Claude" w:date="2026-09-24T18:00:00Z">
+        <w:r>
+          <w:rPr>
+            <w:rFonts w:eastAsia="Times New Roman"/>
+          </w:rPr>
+          <w:t xml:space="preserve">If the Sigil was paired with a different Atlas, hold its Pair button for 10 seconds to make it forget, then pair it again.</w:t>
+        </w:r>
+      </w:ins>
     </w:p>
     <w:p>
       <w:pPr>

</xml_diff>